<commit_message>
Wave 3 integration review fixes; sync TOC; rebuild deliverables with Ch 1-23
Review of Ch 18-23: fixed bulkhead rate/concurrency error in Ch 22 (S1),
a broken cross-reference, running-example consistency notes, and
terminology. Adds build/sync_toc.py. D1 now 1,465 pages.

Co-Authored-By: Claude Opus 5.5 <noreply@anthropic.com>
Claude-Session: https://claude.ai/code/session_01KD1PV4QYjXu36Gz9iKmJiD
</commit_message>
<xml_diff>
--- a/dist/D9-glossary.docx
+++ b/dist/D9-glossary.docx
@@ -345,6 +345,63 @@
           <w:bCs/>
           <w:b/>
         </w:rPr>
+        <w:t xml:space="preserve">Active–passive and active–active</w:t>
+      </w:r>
+      <w:r>
+        <w:t xml:space="preserve"> </w:t>
+      </w:r>
+      <w:r>
+        <w:t xml:space="preserve">— In an</w:t>
+      </w:r>
+      <w:r>
+        <w:t xml:space="preserve"> </w:t>
+      </w:r>
+      <w:r>
+        <w:rPr>
+          <w:bCs/>
+          <w:b/>
+        </w:rPr>
+        <w:t xml:space="preserve">active–passive</w:t>
+      </w:r>
+      <w:r>
+        <w:t xml:space="preserve"> </w:t>
+      </w:r>
+      <w:r>
+        <w:t xml:space="preserve">pair, one balancer carries all traffic while a standby monitors it and takes over the VIP on failure. In</w:t>
+      </w:r>
+      <w:r>
+        <w:t xml:space="preserve"> </w:t>
+      </w:r>
+      <w:r>
+        <w:rPr>
+          <w:bCs/>
+          <w:b/>
+        </w:rPr>
+        <w:t xml:space="preserve">active–active</w:t>
+      </w:r>
+      <w:r>
+        <w:t xml:space="preserve">, all balancers carry traffic at once (spread by DNS, ECMP or anycast), and survivors absorb a failed member’s share.</w:t>
+      </w:r>
+      <w:r>
+        <w:t xml:space="preserve"> </w:t>
+      </w:r>
+      <w:r>
+        <w:rPr>
+          <w:iCs/>
+          <w:i/>
+        </w:rPr>
+        <w:t xml:space="preserve">(§19.7)</w:t>
+      </w:r>
+    </w:p>
+    <w:p>
+      <w:pPr>
+        <w:pStyle w:val="BodyText"/>
+      </w:pPr>
+      <w:r>
+        <w:rPr>
+          <w:bCs/>
+          <w:b/>
+        </w:rPr>
         <w:t xml:space="preserve">Active recall</w:t>
       </w:r>
       <w:r>
@@ -1010,6 +1067,82 @@
           <w:i/>
         </w:rPr>
         <w:t xml:space="preserve">(§16.9.1)</w:t>
+      </w:r>
+    </w:p>
+    <w:p>
+      <w:pPr>
+        <w:pStyle w:val="BodyText"/>
+      </w:pPr>
+      <w:r>
+        <w:rPr>
+          <w:bCs/>
+          <w:b/>
+        </w:rPr>
+        <w:t xml:space="preserve">Autoscaling</w:t>
+      </w:r>
+      <w:r>
+        <w:t xml:space="preserve"> </w:t>
+      </w:r>
+      <w:r>
+        <w:t xml:space="preserve">— Automatically changing the number of instances of a service in response to a measured or forecast signal, within configured minimum and maximum bounds.</w:t>
+      </w:r>
+      <w:r>
+        <w:t xml:space="preserve"> </w:t>
+      </w:r>
+      <w:r>
+        <w:rPr>
+          <w:bCs/>
+          <w:b/>
+        </w:rPr>
+        <w:t xml:space="preserve">Reactive</w:t>
+      </w:r>
+      <w:r>
+        <w:t xml:space="preserve"> </w:t>
+      </w:r>
+      <w:r>
+        <w:t xml:space="preserve">autoscaling responds to current metrics;</w:t>
+      </w:r>
+      <w:r>
+        <w:t xml:space="preserve"> </w:t>
+      </w:r>
+      <w:r>
+        <w:rPr>
+          <w:bCs/>
+          <w:b/>
+        </w:rPr>
+        <w:t xml:space="preserve">scheduled</w:t>
+      </w:r>
+      <w:r>
+        <w:t xml:space="preserve"> </w:t>
+      </w:r>
+      <w:r>
+        <w:t xml:space="preserve">autoscaling follows a calendar;</w:t>
+      </w:r>
+      <w:r>
+        <w:t xml:space="preserve"> </w:t>
+      </w:r>
+      <w:r>
+        <w:rPr>
+          <w:bCs/>
+          <w:b/>
+        </w:rPr>
+        <w:t xml:space="preserve">predictive</w:t>
+      </w:r>
+      <w:r>
+        <w:t xml:space="preserve"> </w:t>
+      </w:r>
+      <w:r>
+        <w:t xml:space="preserve">autoscaling acts on a forecast.</w:t>
+      </w:r>
+      <w:r>
+        <w:t xml:space="preserve"> </w:t>
+      </w:r>
+      <w:r>
+        <w:rPr>
+          <w:iCs/>
+          <w:i/>
+        </w:rPr>
+        <w:t xml:space="preserve">(§18.8.2)</w:t>
       </w:r>
     </w:p>
     <w:p>
@@ -1214,6 +1347,34 @@
           <w:bCs/>
           <w:b/>
         </w:rPr>
+        <w:t xml:space="preserve">Backpressure</w:t>
+      </w:r>
+      <w:r>
+        <w:t xml:space="preserve"> </w:t>
+      </w:r>
+      <w:r>
+        <w:t xml:space="preserve">— A flow-control mechanism in which a slower downstream component signals upstream components to reduce their sending rate, by blocking, by advertising available capacity, or by rejecting, so that work in progress stays bounded instead of piling up in unbounded buffers.</w:t>
+      </w:r>
+      <w:r>
+        <w:t xml:space="preserve"> </w:t>
+      </w:r>
+      <w:r>
+        <w:rPr>
+          <w:iCs/>
+          <w:i/>
+        </w:rPr>
+        <w:t xml:space="preserve">(§22.10)</w:t>
+      </w:r>
+    </w:p>
+    <w:p>
+      <w:pPr>
+        <w:pStyle w:val="BodyText"/>
+      </w:pPr>
+      <w:r>
+        <w:rPr>
+          <w:bCs/>
+          <w:b/>
+        </w:rPr>
         <w:t xml:space="preserve">Backward and forward compatibility</w:t>
       </w:r>
       <w:r>
@@ -2202,6 +2363,34 @@
         <w:t xml:space="preserve">(§13.4.1)</w:t>
       </w:r>
     </w:p>
+    <w:p>
+      <w:pPr>
+        <w:pStyle w:val="BodyText"/>
+      </w:pPr>
+      <w:r>
+        <w:rPr>
+          <w:bCs/>
+          <w:b/>
+        </w:rPr>
+        <w:t xml:space="preserve">Bulkhead</w:t>
+      </w:r>
+      <w:r>
+        <w:t xml:space="preserve"> </w:t>
+      </w:r>
+      <w:r>
+        <w:t xml:space="preserve">— Partitioning a service’s limited resources (threads, connections, memory, instances) into isolated pools, one per dependency, tenant or workload class, so that exhaustion of one pool cannot starve the others.</w:t>
+      </w:r>
+      <w:r>
+        <w:t xml:space="preserve"> </w:t>
+      </w:r>
+      <w:r>
+        <w:rPr>
+          <w:iCs/>
+          <w:i/>
+        </w:rPr>
+        <w:t xml:space="preserve">(§22.14)</w:t>
+      </w:r>
+    </w:p>
     <w:bookmarkEnd w:id="21"/>
     <w:bookmarkStart w:id="22" w:name="c"/>
     <w:p>
@@ -2221,6 +2410,253 @@
           <w:bCs/>
           <w:b/>
         </w:rPr>
+        <w:t xml:space="preserve">Cache</w:t>
+      </w:r>
+      <w:r>
+        <w:t xml:space="preserve"> </w:t>
+      </w:r>
+      <w:r>
+        <w:t xml:space="preserve">— A store that holds copies of data whose authoritative version lives elsewhere (the</w:t>
+      </w:r>
+      <w:r>
+        <w:t xml:space="preserve"> </w:t>
+      </w:r>
+      <w:r>
+        <w:rPr>
+          <w:bCs/>
+          <w:b/>
+        </w:rPr>
+        <w:t xml:space="preserve">backing store</w:t>
+      </w:r>
+      <w:r>
+        <w:t xml:space="preserve"> </w:t>
+      </w:r>
+      <w:r>
+        <w:t xml:space="preserve">or</w:t>
+      </w:r>
+      <w:r>
+        <w:t xml:space="preserve"> </w:t>
+      </w:r>
+      <w:r>
+        <w:rPr>
+          <w:bCs/>
+          <w:b/>
+        </w:rPr>
+        <w:t xml:space="preserve">source of truth</w:t>
+      </w:r>
+      <w:r>
+        <w:t xml:space="preserve">), placed so that reading the copy is faster or cheaper than reading the original. A lookup that finds the data is a</w:t>
+      </w:r>
+      <w:r>
+        <w:t xml:space="preserve"> </w:t>
+      </w:r>
+      <w:r>
+        <w:rPr>
+          <w:bCs/>
+          <w:b/>
+        </w:rPr>
+        <w:t xml:space="preserve">hit</w:t>
+      </w:r>
+      <w:r>
+        <w:t xml:space="preserve">; one that does not is a</w:t>
+      </w:r>
+      <w:r>
+        <w:t xml:space="preserve"> </w:t>
+      </w:r>
+      <w:r>
+        <w:rPr>
+          <w:bCs/>
+          <w:b/>
+        </w:rPr>
+        <w:t xml:space="preserve">miss</w:t>
+      </w:r>
+      <w:r>
+        <w:t xml:space="preserve">. The</w:t>
+      </w:r>
+      <w:r>
+        <w:t xml:space="preserve"> </w:t>
+      </w:r>
+      <w:r>
+        <w:rPr>
+          <w:bCs/>
+          <w:b/>
+        </w:rPr>
+        <w:t xml:space="preserve">cache hit ratio</w:t>
+      </w:r>
+      <w:r>
+        <w:t xml:space="preserve"> </w:t>
+      </w:r>
+      <m:oMath>
+        <m:r>
+          <m:t>h</m:t>
+        </m:r>
+      </m:oMath>
+      <w:r>
+        <w:t xml:space="preserve"> </w:t>
+      </w:r>
+      <w:r>
+        <w:t xml:space="preserve">is hits divided by lookups; the</w:t>
+      </w:r>
+      <w:r>
+        <w:t xml:space="preserve"> </w:t>
+      </w:r>
+      <w:r>
+        <w:rPr>
+          <w:bCs/>
+          <w:b/>
+        </w:rPr>
+        <w:t xml:space="preserve">miss ratio</w:t>
+      </w:r>
+      <w:r>
+        <w:t xml:space="preserve"> </w:t>
+      </w:r>
+      <w:r>
+        <w:t xml:space="preserve">is</w:t>
+      </w:r>
+      <w:r>
+        <w:t xml:space="preserve"> </w:t>
+      </w:r>
+      <m:oMath>
+        <m:r>
+          <m:t>1</m:t>
+        </m:r>
+        <m:r>
+          <m:rPr>
+            <m:sty m:val="p"/>
+          </m:rPr>
+          <m:t>−</m:t>
+        </m:r>
+        <m:r>
+          <m:t>h</m:t>
+        </m:r>
+      </m:oMath>
+      <w:r>
+        <w:t xml:space="preserve">.</w:t>
+      </w:r>
+      <w:r>
+        <w:t xml:space="preserve"> </w:t>
+      </w:r>
+      <w:r>
+        <w:rPr>
+          <w:iCs/>
+          <w:i/>
+        </w:rPr>
+        <w:t xml:space="preserve">(§20.3.1)</w:t>
+      </w:r>
+    </w:p>
+    <w:p>
+      <w:pPr>
+        <w:pStyle w:val="BodyText"/>
+      </w:pPr>
+      <w:r>
+        <w:rPr>
+          <w:bCs/>
+          <w:b/>
+        </w:rPr>
+        <w:t xml:space="preserve">Cache-aside</w:t>
+      </w:r>
+      <w:r>
+        <w:t xml:space="preserve"> </w:t>
+      </w:r>
+      <w:r>
+        <w:t xml:space="preserve">— The application reads the cache first; on a miss it reads the database and populates the cache itself. On a write it updates the database and then</w:t>
+      </w:r>
+      <w:r>
+        <w:t xml:space="preserve"> </w:t>
+      </w:r>
+      <w:r>
+        <w:rPr>
+          <w:bCs/>
+          <w:b/>
+        </w:rPr>
+        <w:t xml:space="preserve">deletes</w:t>
+      </w:r>
+      <w:r>
+        <w:t xml:space="preserve"> </w:t>
+      </w:r>
+      <w:r>
+        <w:t xml:space="preserve">(invalidates) the cache entry. The cache never talks to the database. Also called</w:t>
+      </w:r>
+      <w:r>
+        <w:t xml:space="preserve"> </w:t>
+      </w:r>
+      <w:r>
+        <w:rPr>
+          <w:bCs/>
+          <w:b/>
+        </w:rPr>
+        <w:t xml:space="preserve">look-aside</w:t>
+      </w:r>
+      <w:r>
+        <w:t xml:space="preserve"> </w:t>
+      </w:r>
+      <w:r>
+        <w:t xml:space="preserve">or</w:t>
+      </w:r>
+      <w:r>
+        <w:t xml:space="preserve"> </w:t>
+      </w:r>
+      <w:r>
+        <w:rPr>
+          <w:bCs/>
+          <w:b/>
+        </w:rPr>
+        <w:t xml:space="preserve">demand-filled</w:t>
+      </w:r>
+      <w:r>
+        <w:t xml:space="preserve"> </w:t>
+      </w:r>
+      <w:r>
+        <w:t xml:space="preserve">caching.</w:t>
+      </w:r>
+      <w:r>
+        <w:t xml:space="preserve"> </w:t>
+      </w:r>
+      <w:r>
+        <w:rPr>
+          <w:iCs/>
+          <w:i/>
+        </w:rPr>
+        <w:t xml:space="preserve">(§20.7.1)</w:t>
+      </w:r>
+    </w:p>
+    <w:p>
+      <w:pPr>
+        <w:pStyle w:val="BodyText"/>
+      </w:pPr>
+      <w:r>
+        <w:rPr>
+          <w:bCs/>
+          <w:b/>
+        </w:rPr>
+        <w:t xml:space="preserve">Cache avalanche</w:t>
+      </w:r>
+      <w:r>
+        <w:t xml:space="preserve"> </w:t>
+      </w:r>
+      <w:r>
+        <w:t xml:space="preserve">— A large fraction of cache entries becomes unavailable at once, because many keys expire together or because cache nodes fail or restart, so the database suddenly receives the full read load.</w:t>
+      </w:r>
+      <w:r>
+        <w:t xml:space="preserve"> </w:t>
+      </w:r>
+      <w:r>
+        <w:rPr>
+          <w:iCs/>
+          <w:i/>
+        </w:rPr>
+        <w:t xml:space="preserve">(§20.13)</w:t>
+      </w:r>
+    </w:p>
+    <w:p>
+      <w:pPr>
+        <w:pStyle w:val="BodyText"/>
+      </w:pPr>
+      <w:r>
+        <w:rPr>
+          <w:bCs/>
+          <w:b/>
+        </w:rPr>
         <w:t xml:space="preserve">Cache coherence</w:t>
       </w:r>
       <w:r>
@@ -2249,6 +2685,49 @@
           <w:bCs/>
           <w:b/>
         </w:rPr>
+        <w:t xml:space="preserve">Cache key</w:t>
+      </w:r>
+      <w:r>
+        <w:t xml:space="preserve"> </w:t>
+      </w:r>
+      <w:r>
+        <w:t xml:space="preserve">— The value a cache uses to decide whether two requests may receive the same stored response. By default it is the method plus the full URL (scheme, host, path and query string), extended by any request headers listed in the response’s</w:t>
+      </w:r>
+      <w:r>
+        <w:t xml:space="preserve"> </w:t>
+      </w:r>
+      <w:r>
+        <w:rPr>
+          <w:rStyle w:val="VerbatimChar"/>
+        </w:rPr>
+        <w:t xml:space="preserve">Vary</w:t>
+      </w:r>
+      <w:r>
+        <w:t xml:space="preserve"> </w:t>
+      </w:r>
+      <w:r>
+        <w:t xml:space="preserve">header.</w:t>
+      </w:r>
+      <w:r>
+        <w:t xml:space="preserve"> </w:t>
+      </w:r>
+      <w:r>
+        <w:rPr>
+          <w:iCs/>
+          <w:i/>
+        </w:rPr>
+        <w:t xml:space="preserve">(§21.6.2)</w:t>
+      </w:r>
+    </w:p>
+    <w:p>
+      <w:pPr>
+        <w:pStyle w:val="BodyText"/>
+      </w:pPr>
+      <w:r>
+        <w:rPr>
+          <w:bCs/>
+          <w:b/>
+        </w:rPr>
         <w:t xml:space="preserve">Cache line</w:t>
       </w:r>
       <w:r>
@@ -2266,6 +2745,227 @@
           <w:i/>
         </w:rPr>
         <w:t xml:space="preserve">(§5.4.3)</w:t>
+      </w:r>
+    </w:p>
+    <w:p>
+      <w:pPr>
+        <w:pStyle w:val="BodyText"/>
+      </w:pPr>
+      <w:r>
+        <w:rPr>
+          <w:bCs/>
+          <w:b/>
+        </w:rPr>
+        <w:t xml:space="preserve">Cache penetration</w:t>
+      </w:r>
+      <w:r>
+        <w:t xml:space="preserve"> </w:t>
+      </w:r>
+      <w:r>
+        <w:t xml:space="preserve">— Requests for keys that do not exist in the database. Because there is nothing to cache, every such request misses and reaches the database. A bug or an attacker iterating random IDs can push the database’s full read load through the cache.</w:t>
+      </w:r>
+      <w:r>
+        <w:t xml:space="preserve"> </w:t>
+      </w:r>
+      <w:r>
+        <w:rPr>
+          <w:iCs/>
+          <w:i/>
+        </w:rPr>
+        <w:t xml:space="preserve">(§20.12)</w:t>
+      </w:r>
+    </w:p>
+    <w:p>
+      <w:pPr>
+        <w:pStyle w:val="BodyText"/>
+      </w:pPr>
+      <w:r>
+        <w:rPr>
+          <w:bCs/>
+          <w:b/>
+        </w:rPr>
+        <w:t xml:space="preserve">Cache stampede (thundering herd, dog-piling)</w:t>
+      </w:r>
+      <w:r>
+        <w:t xml:space="preserve"> </w:t>
+      </w:r>
+      <w:r>
+        <w:t xml:space="preserve">— When a popular entry expires or is evicted, many concurrent requests miss at once and all recompute or reload it, multiplying load on the backend exactly when it is busiest.</w:t>
+      </w:r>
+      <w:r>
+        <w:t xml:space="preserve"> </w:t>
+      </w:r>
+      <w:r>
+        <w:rPr>
+          <w:iCs/>
+          <w:i/>
+        </w:rPr>
+        <w:t xml:space="preserve">(§20.11)</w:t>
+      </w:r>
+    </w:p>
+    <w:p>
+      <w:pPr>
+        <w:pStyle w:val="BodyText"/>
+      </w:pPr>
+      <w:r>
+        <w:rPr>
+          <w:bCs/>
+          <w:b/>
+        </w:rPr>
+        <w:t xml:space="preserve">Cache tiers</w:t>
+      </w:r>
+      <w:r>
+        <w:t xml:space="preserve"> </w:t>
+      </w:r>
+      <w:r>
+        <w:t xml:space="preserve">— The</w:t>
+      </w:r>
+      <w:r>
+        <w:t xml:space="preserve"> </w:t>
+      </w:r>
+      <w:r>
+        <w:rPr>
+          <w:bCs/>
+          <w:b/>
+        </w:rPr>
+        <w:t xml:space="preserve">edge</w:t>
+      </w:r>
+      <w:r>
+        <w:t xml:space="preserve"> </w:t>
+      </w:r>
+      <w:r>
+        <w:t xml:space="preserve">tier is the set of PoPs that accept user connections. A</w:t>
+      </w:r>
+      <w:r>
+        <w:t xml:space="preserve"> </w:t>
+      </w:r>
+      <w:r>
+        <w:rPr>
+          <w:bCs/>
+          <w:b/>
+        </w:rPr>
+        <w:t xml:space="preserve">mid-tier</w:t>
+      </w:r>
+      <w:r>
+        <w:t xml:space="preserve"> </w:t>
+      </w:r>
+      <w:r>
+        <w:t xml:space="preserve">(also</w:t>
+      </w:r>
+      <w:r>
+        <w:t xml:space="preserve"> </w:t>
+      </w:r>
+      <w:r>
+        <w:rPr>
+          <w:iCs/>
+          <w:i/>
+        </w:rPr>
+        <w:t xml:space="preserve">parent</w:t>
+      </w:r>
+      <w:r>
+        <w:t xml:space="preserve">,</w:t>
+      </w:r>
+      <w:r>
+        <w:t xml:space="preserve"> </w:t>
+      </w:r>
+      <w:r>
+        <w:rPr>
+          <w:iCs/>
+          <w:i/>
+        </w:rPr>
+        <w:t xml:space="preserve">regional</w:t>
+      </w:r>
+      <w:r>
+        <w:t xml:space="preserve"> </w:t>
+      </w:r>
+      <w:r>
+        <w:t xml:space="preserve">or</w:t>
+      </w:r>
+      <w:r>
+        <w:t xml:space="preserve"> </w:t>
+      </w:r>
+      <w:r>
+        <w:rPr>
+          <w:iCs/>
+          <w:i/>
+        </w:rPr>
+        <w:t xml:space="preserve">upper-tier</w:t>
+      </w:r>
+      <w:r>
+        <w:t xml:space="preserve"> </w:t>
+      </w:r>
+      <w:r>
+        <w:t xml:space="preserve">cache) is a smaller set of larger caches that edges consult on a miss. An</w:t>
+      </w:r>
+      <w:r>
+        <w:t xml:space="preserve"> </w:t>
+      </w:r>
+      <w:r>
+        <w:rPr>
+          <w:bCs/>
+          <w:b/>
+        </w:rPr>
+        <w:t xml:space="preserve">origin shield</w:t>
+      </w:r>
+      <w:r>
+        <w:t xml:space="preserve"> </w:t>
+      </w:r>
+      <w:r>
+        <w:t xml:space="preserve">is a mid-tier designated as the single path to a given origin. The</w:t>
+      </w:r>
+      <w:r>
+        <w:t xml:space="preserve"> </w:t>
+      </w:r>
+      <w:r>
+        <w:rPr>
+          <w:bCs/>
+          <w:b/>
+        </w:rPr>
+        <w:t xml:space="preserve">origin</w:t>
+      </w:r>
+      <w:r>
+        <w:t xml:space="preserve"> </w:t>
+      </w:r>
+      <w:r>
+        <w:t xml:space="preserve">is the customer’s own infrastructure that holds the authoritative content.</w:t>
+      </w:r>
+      <w:r>
+        <w:t xml:space="preserve"> </w:t>
+      </w:r>
+      <w:r>
+        <w:rPr>
+          <w:iCs/>
+          <w:i/>
+        </w:rPr>
+        <w:t xml:space="preserve">(§21.4.1)</w:t>
+      </w:r>
+    </w:p>
+    <w:p>
+      <w:pPr>
+        <w:pStyle w:val="BodyText"/>
+      </w:pPr>
+      <w:r>
+        <w:rPr>
+          <w:bCs/>
+          <w:b/>
+        </w:rPr>
+        <w:t xml:space="preserve">Capacity planning</w:t>
+      </w:r>
+      <w:r>
+        <w:t xml:space="preserve"> </w:t>
+      </w:r>
+      <w:r>
+        <w:t xml:space="preserve">— The recurring process of forecasting demand, translating it into the resources needed to serve it within the service-level objective with stated headroom and redundancy, and acquiring those resources before they are needed, allowing for the lead time to obtain them.</w:t>
+      </w:r>
+      <w:r>
+        <w:t xml:space="preserve"> </w:t>
+      </w:r>
+      <w:r>
+        <w:rPr>
+          <w:iCs/>
+          <w:i/>
+        </w:rPr>
+        <w:t xml:space="preserve">(§18.11.1)</w:t>
       </w:r>
     </w:p>
     <w:p>
@@ -2584,6 +3284,73 @@
           <w:bCs/>
           <w:b/>
         </w:rPr>
+        <w:t xml:space="preserve">Circuit breaker</w:t>
+      </w:r>
+      <w:r>
+        <w:t xml:space="preserve"> </w:t>
+      </w:r>
+      <w:r>
+        <w:t xml:space="preserve">— A client-side proxy for calls to a dependency that tracks recent failures and, when they cross a threshold,</w:t>
+      </w:r>
+      <w:r>
+        <w:t xml:space="preserve"> </w:t>
+      </w:r>
+      <w:r>
+        <w:rPr>
+          <w:bCs/>
+          <w:b/>
+        </w:rPr>
+        <w:t xml:space="preserve">opens</w:t>
+      </w:r>
+      <w:r>
+        <w:t xml:space="preserve">: it fails calls immediately without contacting the dependency for a cool-down period, then lets a few trial calls through (</w:t>
+      </w:r>
+      <w:r>
+        <w:rPr>
+          <w:bCs/>
+          <w:b/>
+        </w:rPr>
+        <w:t xml:space="preserve">half-open</w:t>
+      </w:r>
+      <w:r>
+        <w:t xml:space="preserve">) and</w:t>
+      </w:r>
+      <w:r>
+        <w:t xml:space="preserve"> </w:t>
+      </w:r>
+      <w:r>
+        <w:rPr>
+          <w:bCs/>
+          <w:b/>
+        </w:rPr>
+        <w:t xml:space="preserve">closes</w:t>
+      </w:r>
+      <w:r>
+        <w:t xml:space="preserve"> </w:t>
+      </w:r>
+      <w:r>
+        <w:t xml:space="preserve">again only if they succeed.</w:t>
+      </w:r>
+      <w:r>
+        <w:t xml:space="preserve"> </w:t>
+      </w:r>
+      <w:r>
+        <w:rPr>
+          <w:iCs/>
+          <w:i/>
+        </w:rPr>
+        <w:t xml:space="preserve">(§22.13)</w:t>
+      </w:r>
+    </w:p>
+    <w:p>
+      <w:pPr>
+        <w:pStyle w:val="BodyText"/>
+      </w:pPr>
+      <w:r>
+        <w:rPr>
+          <w:bCs/>
+          <w:b/>
+        </w:rPr>
         <w:t xml:space="preserve">Client–server architecture</w:t>
       </w:r>
       <w:r>
@@ -2640,6 +3407,66 @@
           <w:i/>
         </w:rPr>
         <w:t xml:space="preserve">(§8.3.1)</w:t>
+      </w:r>
+    </w:p>
+    <w:p>
+      <w:pPr>
+        <w:pStyle w:val="BodyText"/>
+      </w:pPr>
+      <w:r>
+        <w:rPr>
+          <w:bCs/>
+          <w:b/>
+        </w:rPr>
+        <w:t xml:space="preserve">Client-side load balancing</w:t>
+      </w:r>
+      <w:r>
+        <w:t xml:space="preserve"> </w:t>
+      </w:r>
+      <w:r>
+        <w:t xml:space="preserve">— The calling process obtains the list of backend endpoints from service discovery (§34.7) and chooses a backend for each request itself, with no proxy in the path. A</w:t>
+      </w:r>
+      <w:r>
+        <w:t xml:space="preserve"> </w:t>
+      </w:r>
+      <w:r>
+        <w:rPr>
+          <w:bCs/>
+          <w:b/>
+        </w:rPr>
+        <w:t xml:space="preserve">lookaside</w:t>
+      </w:r>
+      <w:r>
+        <w:t xml:space="preserve"> </w:t>
+      </w:r>
+      <w:r>
+        <w:t xml:space="preserve">balancer is an external service that tells clients</w:t>
+      </w:r>
+      <w:r>
+        <w:t xml:space="preserve"> </w:t>
+      </w:r>
+      <w:r>
+        <w:rPr>
+          <w:iCs/>
+          <w:i/>
+        </w:rPr>
+        <w:t xml:space="preserve">which</w:t>
+      </w:r>
+      <w:r>
+        <w:t xml:space="preserve"> </w:t>
+      </w:r>
+      <w:r>
+        <w:t xml:space="preserve">backends to use (and with what weights) while the traffic still flows directly from client to backend.</w:t>
+      </w:r>
+      <w:r>
+        <w:t xml:space="preserve"> </w:t>
+      </w:r>
+      <w:r>
+        <w:rPr>
+          <w:iCs/>
+          <w:i/>
+        </w:rPr>
+        <w:t xml:space="preserve">(§19.10)</w:t>
       </w:r>
     </w:p>
     <w:p>
@@ -3464,6 +4291,138 @@
           <w:bCs/>
           <w:b/>
         </w:rPr>
+        <w:t xml:space="preserve">Consistent hashing with bounded loads</w:t>
+      </w:r>
+      <w:r>
+        <w:t xml:space="preserve"> </w:t>
+      </w:r>
+      <w:r>
+        <w:t xml:space="preserve">— A variant of consistent hashing in which every backend has a</w:t>
+      </w:r>
+      <w:r>
+        <w:t xml:space="preserve"> </w:t>
+      </w:r>
+      <w:r>
+        <w:rPr>
+          <w:bCs/>
+          <w:b/>
+        </w:rPr>
+        <w:t xml:space="preserve">capacity</w:t>
+      </w:r>
+      <w:r>
+        <w:t xml:space="preserve"> </w:t>
+      </w:r>
+      <w:r>
+        <w:t xml:space="preserve">of</w:t>
+      </w:r>
+      <w:r>
+        <w:t xml:space="preserve"> </w:t>
+      </w:r>
+      <m:oMath>
+        <m:r>
+          <m:rPr>
+            <m:sty m:val="p"/>
+          </m:rPr>
+          <m:t>⌈</m:t>
+        </m:r>
+        <m:d>
+          <m:dPr>
+            <m:begChr m:val="("/>
+            <m:endChr m:val=")"/>
+            <m:sepChr m:val=""/>
+            <m:grow/>
+          </m:dPr>
+          <m:e>
+            <m:r>
+              <m:t>1</m:t>
+            </m:r>
+            <m:r>
+              <m:rPr>
+                <m:sty m:val="p"/>
+              </m:rPr>
+              <m:t>+</m:t>
+            </m:r>
+            <m:r>
+              <m:t>ε</m:t>
+            </m:r>
+          </m:e>
+        </m:d>
+        <m:r>
+          <m:t> </m:t>
+        </m:r>
+        <m:r>
+          <m:t>m</m:t>
+        </m:r>
+        <m:r>
+          <m:rPr>
+            <m:sty m:val="p"/>
+          </m:rPr>
+          <m:t>/</m:t>
+        </m:r>
+        <m:r>
+          <m:t>n</m:t>
+        </m:r>
+        <m:r>
+          <m:rPr>
+            <m:sty m:val="p"/>
+          </m:rPr>
+          <m:t>⌉</m:t>
+        </m:r>
+      </m:oMath>
+      <w:r>
+        <w:t xml:space="preserve"> </w:t>
+      </w:r>
+      <w:r>
+        <w:t xml:space="preserve">for</w:t>
+      </w:r>
+      <w:r>
+        <w:t xml:space="preserve"> </w:t>
+      </w:r>
+      <m:oMath>
+        <m:r>
+          <m:t>m</m:t>
+        </m:r>
+      </m:oMath>
+      <w:r>
+        <w:t xml:space="preserve"> </w:t>
+      </w:r>
+      <w:r>
+        <w:t xml:space="preserve">current items (requests, sessions) and</w:t>
+      </w:r>
+      <w:r>
+        <w:t xml:space="preserve"> </w:t>
+      </w:r>
+      <m:oMath>
+        <m:r>
+          <m:t>n</m:t>
+        </m:r>
+      </m:oMath>
+      <w:r>
+        <w:t xml:space="preserve"> </w:t>
+      </w:r>
+      <w:r>
+        <w:t xml:space="preserve">backends. An item goes to the first backend clockwise from its hash that is below capacity, so overflow from a full backend walks on to the next [Mirrokni, Thorup &amp; Zadimoghaddam 2018].</w:t>
+      </w:r>
+      <w:r>
+        <w:t xml:space="preserve"> </w:t>
+      </w:r>
+      <w:r>
+        <w:rPr>
+          <w:iCs/>
+          <w:i/>
+        </w:rPr>
+        <w:t xml:space="preserve">(§19.4.7)</w:t>
+      </w:r>
+    </w:p>
+    <w:p>
+      <w:pPr>
+        <w:pStyle w:val="BodyText"/>
+      </w:pPr>
+      <w:r>
+        <w:rPr>
+          <w:bCs/>
+          <w:b/>
+        </w:rPr>
         <w:t xml:space="preserve">Content-defined chunking (CDC)</w:t>
       </w:r>
       <w:r>
@@ -3502,6 +4461,50 @@
           <w:bCs/>
           <w:b/>
         </w:rPr>
+        <w:t xml:space="preserve">Content delivery network (CDN)</w:t>
+      </w:r>
+      <w:r>
+        <w:t xml:space="preserve"> </w:t>
+      </w:r>
+      <w:r>
+        <w:t xml:space="preserve">— A distributed system of caching reverse proxies (§7.12) deployed in many network locations, which serves content on behalf of an</w:t>
+      </w:r>
+      <w:r>
+        <w:t xml:space="preserve"> </w:t>
+      </w:r>
+      <w:r>
+        <w:rPr>
+          <w:bCs/>
+          <w:b/>
+        </w:rPr>
+        <w:t xml:space="preserve">origin</w:t>
+      </w:r>
+      <w:r>
+        <w:t xml:space="preserve"> </w:t>
+      </w:r>
+      <w:r>
+        <w:t xml:space="preserve">(the authoritative server for the content) from the location nearest each user, fetching from the origin only on a cache miss.</w:t>
+      </w:r>
+      <w:r>
+        <w:t xml:space="preserve"> </w:t>
+      </w:r>
+      <w:r>
+        <w:rPr>
+          <w:iCs/>
+          <w:i/>
+        </w:rPr>
+        <w:t xml:space="preserve">(§21.3.1)</w:t>
+      </w:r>
+    </w:p>
+    <w:p>
+      <w:pPr>
+        <w:pStyle w:val="BodyText"/>
+      </w:pPr>
+      <w:r>
+        <w:rPr>
+          <w:bCs/>
+          <w:b/>
+        </w:rPr>
         <w:t xml:space="preserve">Context diagram</w:t>
       </w:r>
       <w:r>
@@ -3547,6 +4550,52 @@
           <w:i/>
         </w:rPr>
         <w:t xml:space="preserve">(§6.4)</w:t>
+      </w:r>
+    </w:p>
+    <w:p>
+      <w:pPr>
+        <w:pStyle w:val="BodyText"/>
+      </w:pPr>
+      <w:r>
+        <w:rPr>
+          <w:bCs/>
+          <w:b/>
+        </w:rPr>
+        <w:t xml:space="preserve">Coordinated omission</w:t>
+      </w:r>
+      <w:r>
+        <w:t xml:space="preserve"> </w:t>
+      </w:r>
+      <w:r>
+        <w:t xml:space="preserve">— A measurement error in which the load generator, by waiting for slow responses before sending more requests, fails to send (and therefore fails to measure) the requests that would have experienced the slowness. The tester and the system</w:t>
+      </w:r>
+      <w:r>
+        <w:t xml:space="preserve"> </w:t>
+      </w:r>
+      <w:r>
+        <w:t xml:space="preserve">“</w:t>
+      </w:r>
+      <w:r>
+        <w:t xml:space="preserve">coordinate</w:t>
+      </w:r>
+      <w:r>
+        <w:t xml:space="preserve">”</w:t>
+      </w:r>
+      <w:r>
+        <w:t xml:space="preserve"> </w:t>
+      </w:r>
+      <w:r>
+        <w:t xml:space="preserve">to omit the worst samples. The term and diagnosis are due to Gil Tene [Tene, How NOT to Measure Latency].</w:t>
+      </w:r>
+      <w:r>
+        <w:t xml:space="preserve"> </w:t>
+      </w:r>
+      <w:r>
+        <w:rPr>
+          <w:iCs/>
+          <w:i/>
+        </w:rPr>
+        <w:t xml:space="preserve">(§23.5.3)</w:t>
       </w:r>
     </w:p>
     <w:p>
@@ -4513,6 +5562,47 @@
           <w:i/>
         </w:rPr>
         <w:t xml:space="preserve">(§5.7.3)</w:t>
+      </w:r>
+    </w:p>
+    <w:p>
+      <w:pPr>
+        <w:pStyle w:val="BodyText"/>
+      </w:pPr>
+      <w:r>
+        <w:rPr>
+          <w:bCs/>
+          <w:b/>
+        </w:rPr>
+        <w:t xml:space="preserve">Direct server return (DSR)</w:t>
+      </w:r>
+      <w:r>
+        <w:t xml:space="preserve"> </w:t>
+      </w:r>
+      <w:r>
+        <w:t xml:space="preserve">— A forwarding mode in which the balancer delivers request packets to the backend but the backend sends responses</w:t>
+      </w:r>
+      <w:r>
+        <w:t xml:space="preserve"> </w:t>
+      </w:r>
+      <w:r>
+        <w:rPr>
+          <w:bCs/>
+          <w:b/>
+        </w:rPr>
+        <w:t xml:space="preserve">directly to the client</w:t>
+      </w:r>
+      <w:r>
+        <w:t xml:space="preserve">, using the VIP as its source address, bypassing the balancer on the return path.</w:t>
+      </w:r>
+      <w:r>
+        <w:t xml:space="preserve"> </w:t>
+      </w:r>
+      <w:r>
+        <w:rPr>
+          <w:iCs/>
+          <w:i/>
+        </w:rPr>
+        <w:t xml:space="preserve">(§19.3.1)</w:t>
       </w:r>
     </w:p>
     <w:p>
@@ -4889,6 +5979,34 @@
           <w:i/>
         </w:rPr>
         <w:t xml:space="preserve">(§4.16.1)</w:t>
+      </w:r>
+    </w:p>
+    <w:p>
+      <w:pPr>
+        <w:pStyle w:val="BodyText"/>
+      </w:pPr>
+      <w:r>
+        <w:rPr>
+          <w:bCs/>
+          <w:b/>
+        </w:rPr>
+        <w:t xml:space="preserve">Dynamic site acceleration (DSA)</w:t>
+      </w:r>
+      <w:r>
+        <w:t xml:space="preserve"> </w:t>
+      </w:r>
+      <w:r>
+        <w:t xml:space="preserve">— Routing uncacheable requests through the CDN anyway, so that TCP and TLS terminate near the user and the edge forwards each request to the origin over pre-established, tuned, long-lived connections, sometimes along an overlay path chosen from measurements.</w:t>
+      </w:r>
+      <w:r>
+        <w:t xml:space="preserve"> </w:t>
+      </w:r>
+      <w:r>
+        <w:rPr>
+          <w:iCs/>
+          <w:i/>
+        </w:rPr>
+        <w:t xml:space="preserve">(§21.7.2)</w:t>
       </w:r>
     </w:p>
     <w:bookmarkEnd w:id="23"/>
@@ -5825,6 +6943,59 @@
           <w:bCs/>
           <w:b/>
         </w:rPr>
+        <w:t xml:space="preserve">Fixed window counter</w:t>
+      </w:r>
+      <w:r>
+        <w:t xml:space="preserve"> </w:t>
+      </w:r>
+      <w:r>
+        <w:t xml:space="preserve">— A limiter that divides time into aligned windows of length</w:t>
+      </w:r>
+      <w:r>
+        <w:t xml:space="preserve"> </w:t>
+      </w:r>
+      <m:oMath>
+        <m:r>
+          <m:t>W</m:t>
+        </m:r>
+      </m:oMath>
+      <w:r>
+        <w:t xml:space="preserve"> </w:t>
+      </w:r>
+      <w:r>
+        <w:t xml:space="preserve">(for example each clock minute), keeps one counter per key per window, and admits a request if the current window’s counter is below the limit</w:t>
+      </w:r>
+      <w:r>
+        <w:t xml:space="preserve"> </w:t>
+      </w:r>
+      <m:oMath>
+        <m:r>
+          <m:t>L</m:t>
+        </m:r>
+      </m:oMath>
+      <w:r>
+        <w:t xml:space="preserve">. The counter resets at each window boundary.</w:t>
+      </w:r>
+      <w:r>
+        <w:t xml:space="preserve"> </w:t>
+      </w:r>
+      <w:r>
+        <w:rPr>
+          <w:iCs/>
+          <w:i/>
+        </w:rPr>
+        <w:t xml:space="preserve">(§22.6.1)</w:t>
+      </w:r>
+    </w:p>
+    <w:p>
+      <w:pPr>
+        <w:pStyle w:val="BodyText"/>
+      </w:pPr>
+      <w:r>
+        <w:rPr>
+          <w:bCs/>
+          <w:b/>
+        </w:rPr>
         <w:t xml:space="preserve">Forward secrecy</w:t>
       </w:r>
       <w:r>
@@ -5876,6 +7047,268 @@
           <w:i/>
         </w:rPr>
         <w:t xml:space="preserve">(§10.4.4)</w:t>
+      </w:r>
+    </w:p>
+    <w:p>
+      <w:pPr>
+        <w:pStyle w:val="BodyText"/>
+      </w:pPr>
+      <w:r>
+        <w:rPr>
+          <w:bCs/>
+          <w:b/>
+        </w:rPr>
+        <w:t xml:space="preserve">Four golden signals</w:t>
+      </w:r>
+      <w:r>
+        <w:t xml:space="preserve"> </w:t>
+      </w:r>
+      <w:r>
+        <w:t xml:space="preserve">— Google’s site reliability engineering guidance says that if you can measure only four metrics of a user-facing system, measure</w:t>
+      </w:r>
+      <w:r>
+        <w:t xml:space="preserve"> </w:t>
+      </w:r>
+      <w:r>
+        <w:rPr>
+          <w:bCs/>
+          <w:b/>
+        </w:rPr>
+        <w:t xml:space="preserve">latency</w:t>
+      </w:r>
+      <w:r>
+        <w:t xml:space="preserve"> </w:t>
+      </w:r>
+      <w:r>
+        <w:t xml:space="preserve">(time to serve a request, tracking successful and failed requests separately),</w:t>
+      </w:r>
+      <w:r>
+        <w:t xml:space="preserve"> </w:t>
+      </w:r>
+      <w:r>
+        <w:rPr>
+          <w:bCs/>
+          <w:b/>
+        </w:rPr>
+        <w:t xml:space="preserve">traffic</w:t>
+      </w:r>
+      <w:r>
+        <w:t xml:space="preserve"> </w:t>
+      </w:r>
+      <w:r>
+        <w:t xml:space="preserve">(demand, such as requests per second),</w:t>
+      </w:r>
+      <w:r>
+        <w:t xml:space="preserve"> </w:t>
+      </w:r>
+      <w:r>
+        <w:rPr>
+          <w:bCs/>
+          <w:b/>
+        </w:rPr>
+        <w:t xml:space="preserve">errors</w:t>
+      </w:r>
+      <w:r>
+        <w:t xml:space="preserve"> </w:t>
+      </w:r>
+      <w:r>
+        <w:t xml:space="preserve">(rate of failed requests, explicit or implicit) and</w:t>
+      </w:r>
+      <w:r>
+        <w:t xml:space="preserve"> </w:t>
+      </w:r>
+      <w:r>
+        <w:rPr>
+          <w:bCs/>
+          <w:b/>
+        </w:rPr>
+        <w:t xml:space="preserve">saturation</w:t>
+      </w:r>
+      <w:r>
+        <w:t xml:space="preserve"> </w:t>
+      </w:r>
+      <w:r>
+        <w:t xml:space="preserve">(how</w:t>
+      </w:r>
+      <w:r>
+        <w:t xml:space="preserve"> </w:t>
+      </w:r>
+      <w:r>
+        <w:t xml:space="preserve">“</w:t>
+      </w:r>
+      <w:r>
+        <w:t xml:space="preserve">full</w:t>
+      </w:r>
+      <w:r>
+        <w:t xml:space="preserve">”</w:t>
+      </w:r>
+      <w:r>
+        <w:t xml:space="preserve"> </w:t>
+      </w:r>
+      <w:r>
+        <w:t xml:space="preserve">the service is, emphasizing its most constrained resource) [Beyer et al. 2016, ch. 6].</w:t>
+      </w:r>
+      <w:r>
+        <w:t xml:space="preserve"> </w:t>
+      </w:r>
+      <w:r>
+        <w:rPr>
+          <w:iCs/>
+          <w:i/>
+        </w:rPr>
+        <w:t xml:space="preserve">(§23.3.3)</w:t>
+      </w:r>
+    </w:p>
+    <w:p>
+      <w:pPr>
+        <w:pStyle w:val="BodyText"/>
+      </w:pPr>
+      <w:r>
+        <w:rPr>
+          <w:bCs/>
+          <w:b/>
+        </w:rPr>
+        <w:t xml:space="preserve">Freshness and validation</w:t>
+      </w:r>
+      <w:r>
+        <w:t xml:space="preserve"> </w:t>
+      </w:r>
+      <w:r>
+        <w:t xml:space="preserve">— A stored response is</w:t>
+      </w:r>
+      <w:r>
+        <w:t xml:space="preserve"> </w:t>
+      </w:r>
+      <w:r>
+        <w:rPr>
+          <w:bCs/>
+          <w:b/>
+        </w:rPr>
+        <w:t xml:space="preserve">fresh</w:t>
+      </w:r>
+      <w:r>
+        <w:t xml:space="preserve"> </w:t>
+      </w:r>
+      <w:r>
+        <w:t xml:space="preserve">while its age is below its</w:t>
+      </w:r>
+      <w:r>
+        <w:t xml:space="preserve"> </w:t>
+      </w:r>
+      <w:r>
+        <w:rPr>
+          <w:bCs/>
+          <w:b/>
+        </w:rPr>
+        <w:t xml:space="preserve">freshness lifetime</w:t>
+      </w:r>
+      <w:r>
+        <w:t xml:space="preserve"> </w:t>
+      </w:r>
+      <w:r>
+        <w:t xml:space="preserve">and may then be served without contacting the origin; once</w:t>
+      </w:r>
+      <w:r>
+        <w:t xml:space="preserve"> </w:t>
+      </w:r>
+      <w:r>
+        <w:rPr>
+          <w:bCs/>
+          <w:b/>
+        </w:rPr>
+        <w:t xml:space="preserve">stale</w:t>
+      </w:r>
+      <w:r>
+        <w:t xml:space="preserve">, it must normally be</w:t>
+      </w:r>
+      <w:r>
+        <w:t xml:space="preserve"> </w:t>
+      </w:r>
+      <w:r>
+        <w:rPr>
+          <w:bCs/>
+          <w:b/>
+        </w:rPr>
+        <w:t xml:space="preserve">revalidated</w:t>
+      </w:r>
+      <w:r>
+        <w:t xml:space="preserve">, by sending a conditional request (</w:t>
+      </w:r>
+      <w:r>
+        <w:rPr>
+          <w:rStyle w:val="VerbatimChar"/>
+        </w:rPr>
+        <w:t xml:space="preserve">If-None-Match</w:t>
+      </w:r>
+      <w:r>
+        <w:t xml:space="preserve"> </w:t>
+      </w:r>
+      <w:r>
+        <w:t xml:space="preserve">with the stored</w:t>
+      </w:r>
+      <w:r>
+        <w:t xml:space="preserve"> </w:t>
+      </w:r>
+      <w:r>
+        <w:rPr>
+          <w:rStyle w:val="VerbatimChar"/>
+        </w:rPr>
+        <w:t xml:space="preserve">ETag</w:t>
+      </w:r>
+      <w:r>
+        <w:t xml:space="preserve">, or</w:t>
+      </w:r>
+      <w:r>
+        <w:t xml:space="preserve"> </w:t>
+      </w:r>
+      <w:r>
+        <w:rPr>
+          <w:rStyle w:val="VerbatimChar"/>
+        </w:rPr>
+        <w:t xml:space="preserve">If-Modified-Since</w:t>
+      </w:r>
+      <w:r>
+        <w:t xml:space="preserve">), to which the origin answers</w:t>
+      </w:r>
+      <w:r>
+        <w:t xml:space="preserve"> </w:t>
+      </w:r>
+      <w:r>
+        <w:rPr>
+          <w:rStyle w:val="VerbatimChar"/>
+        </w:rPr>
+        <w:t xml:space="preserve">304 Not Modified</w:t>
+      </w:r>
+      <w:r>
+        <w:t xml:space="preserve"> </w:t>
+      </w:r>
+      <w:r>
+        <w:t xml:space="preserve">(keep using the copy) or</w:t>
+      </w:r>
+      <w:r>
+        <w:t xml:space="preserve"> </w:t>
+      </w:r>
+      <w:r>
+        <w:rPr>
+          <w:rStyle w:val="VerbatimChar"/>
+        </w:rPr>
+        <w:t xml:space="preserve">200 OK</w:t>
+      </w:r>
+      <w:r>
+        <w:t xml:space="preserve"> </w:t>
+      </w:r>
+      <w:r>
+        <w:t xml:space="preserve">with a new body [RFC 9111; RFC 9110].</w:t>
+      </w:r>
+      <w:r>
+        <w:t xml:space="preserve"> </w:t>
+      </w:r>
+      <w:r>
+        <w:rPr>
+          <w:iCs/>
+          <w:i/>
+        </w:rPr>
+        <w:t xml:space="preserve">(§21.6.1)</w:t>
       </w:r>
     </w:p>
     <w:p>
@@ -6085,6 +7518,95 @@
           <w:bCs/>
           <w:b/>
         </w:rPr>
+        <w:t xml:space="preserve">Garbage collection (GC)</w:t>
+      </w:r>
+      <w:r>
+        <w:t xml:space="preserve"> </w:t>
+      </w:r>
+      <w:r>
+        <w:t xml:space="preserve">— Automatic reclamation of heap memory that the program can no longer reach. A</w:t>
+      </w:r>
+      <w:r>
+        <w:t xml:space="preserve"> </w:t>
+      </w:r>
+      <w:r>
+        <w:rPr>
+          <w:bCs/>
+          <w:b/>
+        </w:rPr>
+        <w:t xml:space="preserve">tracing</w:t>
+      </w:r>
+      <w:r>
+        <w:t xml:space="preserve"> </w:t>
+      </w:r>
+      <w:r>
+        <w:t xml:space="preserve">collector finds live objects by following references from</w:t>
+      </w:r>
+      <w:r>
+        <w:t xml:space="preserve"> </w:t>
+      </w:r>
+      <w:r>
+        <w:rPr>
+          <w:bCs/>
+          <w:b/>
+        </w:rPr>
+        <w:t xml:space="preserve">roots</w:t>
+      </w:r>
+      <w:r>
+        <w:t xml:space="preserve"> </w:t>
+      </w:r>
+      <w:r>
+        <w:t xml:space="preserve">(stacks, globals, registers) and reclaims everything else. A</w:t>
+      </w:r>
+      <w:r>
+        <w:t xml:space="preserve"> </w:t>
+      </w:r>
+      <w:r>
+        <w:rPr>
+          <w:bCs/>
+          <w:b/>
+        </w:rPr>
+        <w:t xml:space="preserve">stop-the-world (STW) pause</w:t>
+      </w:r>
+      <w:r>
+        <w:t xml:space="preserve"> </w:t>
+      </w:r>
+      <w:r>
+        <w:t xml:space="preserve">is an interval in which all application threads (the</w:t>
+      </w:r>
+      <w:r>
+        <w:t xml:space="preserve"> </w:t>
+      </w:r>
+      <w:r>
+        <w:rPr>
+          <w:bCs/>
+          <w:b/>
+        </w:rPr>
+        <w:t xml:space="preserve">mutator</w:t>
+      </w:r>
+      <w:r>
+        <w:t xml:space="preserve">) are halted so the collector can work on a consistent heap [Jones et al. 2023].</w:t>
+      </w:r>
+      <w:r>
+        <w:t xml:space="preserve"> </w:t>
+      </w:r>
+      <w:r>
+        <w:rPr>
+          <w:iCs/>
+          <w:i/>
+        </w:rPr>
+        <w:t xml:space="preserve">(§23.9.1)</w:t>
+      </w:r>
+    </w:p>
+    <w:p>
+      <w:pPr>
+        <w:pStyle w:val="BodyText"/>
+      </w:pPr>
+      <w:r>
+        <w:rPr>
+          <w:bCs/>
+          <w:b/>
+        </w:rPr>
         <w:t xml:space="preserve">Geohash</w:t>
       </w:r>
       <w:r>
@@ -6473,6 +7995,221 @@
           <w:bCs/>
           <w:b/>
         </w:rPr>
+        <w:t xml:space="preserve">Hash slot (Redis Cluster)</w:t>
+      </w:r>
+      <w:r>
+        <w:t xml:space="preserve"> </w:t>
+      </w:r>
+      <w:r>
+        <w:t xml:space="preserve">— One of 16,384 buckets into which Redis Cluster divides the keyspace:</w:t>
+      </w:r>
+      <w:r>
+        <w:t xml:space="preserve"> </w:t>
+      </w:r>
+      <w:r>
+        <w:rPr>
+          <w:rStyle w:val="VerbatimChar"/>
+        </w:rPr>
+        <w:t xml:space="preserve">slot = CRC16(key) mod 16384</w:t>
+      </w:r>
+      <w:r>
+        <w:t xml:space="preserve">. Each primary owns a set of slots. If a key contains</w:t>
+      </w:r>
+      <w:r>
+        <w:t xml:space="preserve"> </w:t>
+      </w:r>
+      <w:r>
+        <w:rPr>
+          <w:rStyle w:val="VerbatimChar"/>
+        </w:rPr>
+        <w:t xml:space="preserve">{...}</w:t>
+      </w:r>
+      <w:r>
+        <w:t xml:space="preserve">, only the substring inside the braces (a</w:t>
+      </w:r>
+      <w:r>
+        <w:t xml:space="preserve"> </w:t>
+      </w:r>
+      <w:r>
+        <w:rPr>
+          <w:bCs/>
+          <w:b/>
+        </w:rPr>
+        <w:t xml:space="preserve">hash tag</w:t>
+      </w:r>
+      <w:r>
+        <w:t xml:space="preserve">) is hashed, so related keys can be forced into one slot [Redis Docs: Cluster specification].</w:t>
+      </w:r>
+      <w:r>
+        <w:t xml:space="preserve"> </w:t>
+      </w:r>
+      <w:r>
+        <w:rPr>
+          <w:iCs/>
+          <w:i/>
+        </w:rPr>
+        <w:t xml:space="preserve">(§20.6.4)</w:t>
+      </w:r>
+    </w:p>
+    <w:p>
+      <w:pPr>
+        <w:pStyle w:val="BodyText"/>
+      </w:pPr>
+      <w:r>
+        <w:rPr>
+          <w:bCs/>
+          <w:b/>
+        </w:rPr>
+        <w:t xml:space="preserve">Health check</w:t>
+      </w:r>
+      <w:r>
+        <w:t xml:space="preserve"> </w:t>
+      </w:r>
+      <w:r>
+        <w:t xml:space="preserve">— A mechanism by which a balancer decides whether a backend should receive traffic. An</w:t>
+      </w:r>
+      <w:r>
+        <w:t xml:space="preserve"> </w:t>
+      </w:r>
+      <w:r>
+        <w:rPr>
+          <w:bCs/>
+          <w:b/>
+        </w:rPr>
+        <w:t xml:space="preserve">active</w:t>
+      </w:r>
+      <w:r>
+        <w:t xml:space="preserve"> </w:t>
+      </w:r>
+      <w:r>
+        <w:t xml:space="preserve">check sends synthetic probes (a TCP connect, an HTTP</w:t>
+      </w:r>
+      <w:r>
+        <w:t xml:space="preserve"> </w:t>
+      </w:r>
+      <w:r>
+        <w:rPr>
+          <w:rStyle w:val="VerbatimChar"/>
+        </w:rPr>
+        <w:t xml:space="preserve">GET /healthz</w:t>
+      </w:r>
+      <w:r>
+        <w:t xml:space="preserve">, a gRPC health RPC) on a timer. A</w:t>
+      </w:r>
+      <w:r>
+        <w:t xml:space="preserve"> </w:t>
+      </w:r>
+      <w:r>
+        <w:rPr>
+          <w:bCs/>
+          <w:b/>
+        </w:rPr>
+        <w:t xml:space="preserve">passive</w:t>
+      </w:r>
+      <w:r>
+        <w:t xml:space="preserve"> </w:t>
+      </w:r>
+      <w:r>
+        <w:t xml:space="preserve">check, also called</w:t>
+      </w:r>
+      <w:r>
+        <w:t xml:space="preserve"> </w:t>
+      </w:r>
+      <w:r>
+        <w:rPr>
+          <w:bCs/>
+          <w:b/>
+        </w:rPr>
+        <w:t xml:space="preserve">outlier detection</w:t>
+      </w:r>
+      <w:r>
+        <w:t xml:space="preserve">, watches real traffic for errors, timeouts or latency and</w:t>
+      </w:r>
+      <w:r>
+        <w:t xml:space="preserve"> </w:t>
+      </w:r>
+      <w:r>
+        <w:rPr>
+          <w:bCs/>
+          <w:b/>
+        </w:rPr>
+        <w:t xml:space="preserve">ejects</w:t>
+      </w:r>
+      <w:r>
+        <w:t xml:space="preserve"> </w:t>
+      </w:r>
+      <w:r>
+        <w:t xml:space="preserve">misbehaving backends for a period.</w:t>
+      </w:r>
+      <w:r>
+        <w:t xml:space="preserve"> </w:t>
+      </w:r>
+      <w:r>
+        <w:rPr>
+          <w:iCs/>
+          <w:i/>
+        </w:rPr>
+        <w:t xml:space="preserve">(§19.5.1)</w:t>
+      </w:r>
+    </w:p>
+    <w:p>
+      <w:pPr>
+        <w:pStyle w:val="BodyText"/>
+      </w:pPr>
+      <w:r>
+        <w:rPr>
+          <w:bCs/>
+          <w:b/>
+        </w:rPr>
+        <w:t xml:space="preserve">Hedged request</w:t>
+      </w:r>
+      <w:r>
+        <w:t xml:space="preserve"> </w:t>
+      </w:r>
+      <w:r>
+        <w:t xml:space="preserve">— A request sent to one replica and, if no response arrives within a</w:t>
+      </w:r>
+      <w:r>
+        <w:t xml:space="preserve"> </w:t>
+      </w:r>
+      <w:r>
+        <w:rPr>
+          <w:bCs/>
+          <w:b/>
+        </w:rPr>
+        <w:t xml:space="preserve">hedge delay</w:t>
+      </w:r>
+      <w:r>
+        <w:t xml:space="preserve"> </w:t>
+      </w:r>
+      <m:oMath>
+        <m:r>
+          <m:t>d</m:t>
+        </m:r>
+      </m:oMath>
+      <w:r>
+        <w:t xml:space="preserve">, sent again to a second replica; the client uses whichever response arrives first and cancels or ignores the other [Dean and Barroso 2013].</w:t>
+      </w:r>
+      <w:r>
+        <w:t xml:space="preserve"> </w:t>
+      </w:r>
+      <w:r>
+        <w:rPr>
+          <w:iCs/>
+          <w:i/>
+        </w:rPr>
+        <w:t xml:space="preserve">(§23.7.1)</w:t>
+      </w:r>
+    </w:p>
+    <w:p>
+      <w:pPr>
+        <w:pStyle w:val="BodyText"/>
+      </w:pPr>
+      <w:r>
+        <w:rPr>
+          <w:bCs/>
+          <w:b/>
+        </w:rPr>
         <w:t xml:space="preserve">High-level design (HLD)</w:t>
       </w:r>
       <w:r>
@@ -6501,6 +8238,75 @@
           <w:bCs/>
           <w:b/>
         </w:rPr>
+        <w:t xml:space="preserve">Horizontal scaling (scaling out)</w:t>
+      </w:r>
+      <w:r>
+        <w:t xml:space="preserve"> </w:t>
+      </w:r>
+      <w:r>
+        <w:t xml:space="preserve">— Increasing capacity by adding more nodes that share the workload, for example by running 20 identical application servers behind a load balancer instead of one. Removing nodes when load falls is</w:t>
+      </w:r>
+      <w:r>
+        <w:t xml:space="preserve"> </w:t>
+      </w:r>
+      <w:r>
+        <w:rPr>
+          <w:bCs/>
+          <w:b/>
+        </w:rPr>
+        <w:t xml:space="preserve">scaling in</w:t>
+      </w:r>
+      <w:r>
+        <w:t xml:space="preserve">.</w:t>
+      </w:r>
+      <w:r>
+        <w:t xml:space="preserve"> </w:t>
+      </w:r>
+      <w:r>
+        <w:rPr>
+          <w:iCs/>
+          <w:i/>
+        </w:rPr>
+        <w:t xml:space="preserve">(§18.4.1)</w:t>
+      </w:r>
+    </w:p>
+    <w:p>
+      <w:pPr>
+        <w:pStyle w:val="BodyText"/>
+      </w:pPr>
+      <w:r>
+        <w:rPr>
+          <w:bCs/>
+          <w:b/>
+        </w:rPr>
+        <w:t xml:space="preserve">Hot key</w:t>
+      </w:r>
+      <w:r>
+        <w:t xml:space="preserve"> </w:t>
+      </w:r>
+      <w:r>
+        <w:t xml:space="preserve">— A single key whose request rate exceeds what the node holding it can serve, so partitioning cannot help: all requests for one key go to one node.</w:t>
+      </w:r>
+      <w:r>
+        <w:t xml:space="preserve"> </w:t>
+      </w:r>
+      <w:r>
+        <w:rPr>
+          <w:iCs/>
+          <w:i/>
+        </w:rPr>
+        <w:t xml:space="preserve">(§20.15)</w:t>
+      </w:r>
+    </w:p>
+    <w:p>
+      <w:pPr>
+        <w:pStyle w:val="BodyText"/>
+      </w:pPr>
+      <w:r>
+        <w:rPr>
+          <w:bCs/>
+          <w:b/>
+        </w:rPr>
         <w:t xml:space="preserve">Hot partition and hot key</w:t>
       </w:r>
       <w:r>
@@ -6566,6 +8372,79 @@
           <w:i/>
         </w:rPr>
         <w:t xml:space="preserve">(§14.10.1)</w:t>
+      </w:r>
+    </w:p>
+    <w:p>
+      <w:pPr>
+        <w:pStyle w:val="BodyText"/>
+      </w:pPr>
+      <w:r>
+        <w:rPr>
+          <w:bCs/>
+          <w:b/>
+        </w:rPr>
+        <w:t xml:space="preserve">HTTP adaptive streaming</w:t>
+      </w:r>
+      <w:r>
+        <w:t xml:space="preserve"> </w:t>
+      </w:r>
+      <w:r>
+        <w:t xml:space="preserve">— Video is encoded at several quality levels (a</w:t>
+      </w:r>
+      <w:r>
+        <w:t xml:space="preserve"> </w:t>
+      </w:r>
+      <w:r>
+        <w:rPr>
+          <w:bCs/>
+          <w:b/>
+        </w:rPr>
+        <w:t xml:space="preserve">bitrate ladder</w:t>
+      </w:r>
+      <w:r>
+        <w:t xml:space="preserve">), each cut into</w:t>
+      </w:r>
+      <w:r>
+        <w:t xml:space="preserve"> </w:t>
+      </w:r>
+      <w:r>
+        <w:rPr>
+          <w:bCs/>
+          <w:b/>
+        </w:rPr>
+        <w:t xml:space="preserve">segments</w:t>
+      </w:r>
+      <w:r>
+        <w:t xml:space="preserve"> </w:t>
+      </w:r>
+      <w:r>
+        <w:t xml:space="preserve">of a few seconds stored as ordinary files. A</w:t>
+      </w:r>
+      <w:r>
+        <w:t xml:space="preserve"> </w:t>
+      </w:r>
+      <w:r>
+        <w:rPr>
+          <w:bCs/>
+          <w:b/>
+        </w:rPr>
+        <w:t xml:space="preserve">manifest</w:t>
+      </w:r>
+      <w:r>
+        <w:t xml:space="preserve"> </w:t>
+      </w:r>
+      <w:r>
+        <w:t xml:space="preserve">lists the levels and segment URLs. The player downloads the manifest, then fetches segments one by one over HTTP, choosing a level for each segment.</w:t>
+      </w:r>
+      <w:r>
+        <w:t xml:space="preserve"> </w:t>
+      </w:r>
+      <w:r>
+        <w:rPr>
+          <w:iCs/>
+          <w:i/>
+        </w:rPr>
+        <w:t xml:space="preserve">(§21.8.1)</w:t>
       </w:r>
     </w:p>
     <w:p>
@@ -6728,6 +8607,65 @@
           <w:bCs/>
           <w:b/>
         </w:rPr>
+        <w:t xml:space="preserve">Idempotency key</w:t>
+      </w:r>
+      <w:r>
+        <w:t xml:space="preserve"> </w:t>
+      </w:r>
+      <w:r>
+        <w:t xml:space="preserve">— A unique value, generated by the client once per</w:t>
+      </w:r>
+      <w:r>
+        <w:t xml:space="preserve"> </w:t>
+      </w:r>
+      <w:r>
+        <w:rPr>
+          <w:iCs/>
+          <w:i/>
+        </w:rPr>
+        <w:t xml:space="preserve">logical</w:t>
+      </w:r>
+      <w:r>
+        <w:t xml:space="preserve"> </w:t>
+      </w:r>
+      <w:r>
+        <w:t xml:space="preserve">operation and sent with every attempt of that operation (for example in an</w:t>
+      </w:r>
+      <w:r>
+        <w:t xml:space="preserve"> </w:t>
+      </w:r>
+      <w:r>
+        <w:rPr>
+          <w:rStyle w:val="VerbatimChar"/>
+        </w:rPr>
+        <w:t xml:space="preserve">Idempotency-Key</w:t>
+      </w:r>
+      <w:r>
+        <w:t xml:space="preserve"> </w:t>
+      </w:r>
+      <w:r>
+        <w:t xml:space="preserve">header), that the server uses to recognize retries: the first attempt executes and its result is stored under the key; later attempts with the same key return the stored result instead of executing again.</w:t>
+      </w:r>
+      <w:r>
+        <w:t xml:space="preserve"> </w:t>
+      </w:r>
+      <w:r>
+        <w:rPr>
+          <w:iCs/>
+          <w:i/>
+        </w:rPr>
+        <w:t xml:space="preserve">(§22.15.1)</w:t>
+      </w:r>
+    </w:p>
+    <w:p>
+      <w:pPr>
+        <w:pStyle w:val="BodyText"/>
+      </w:pPr>
+      <w:r>
+        <w:rPr>
+          <w:bCs/>
+          <w:b/>
+        </w:rPr>
         <w:t xml:space="preserve">Idempotent method</w:t>
       </w:r>
       <w:r>
@@ -7779,6 +9717,92 @@
           <w:bCs/>
           <w:b/>
         </w:rPr>
+        <w:t xml:space="preserve">Layer 4 (L4) and layer 7 (L7) load balancing</w:t>
+      </w:r>
+      <w:r>
+        <w:t xml:space="preserve"> </w:t>
+      </w:r>
+      <w:r>
+        <w:t xml:space="preserve">— An</w:t>
+      </w:r>
+      <w:r>
+        <w:t xml:space="preserve"> </w:t>
+      </w:r>
+      <w:r>
+        <w:rPr>
+          <w:bCs/>
+          <w:b/>
+        </w:rPr>
+        <w:t xml:space="preserve">L4 load balancer</w:t>
+      </w:r>
+      <w:r>
+        <w:t xml:space="preserve"> </w:t>
+      </w:r>
+      <w:r>
+        <w:t xml:space="preserve">makes its decision from transport-layer information (IP addresses, ports, protocol) and balances</w:t>
+      </w:r>
+      <w:r>
+        <w:t xml:space="preserve"> </w:t>
+      </w:r>
+      <w:r>
+        <w:rPr>
+          <w:bCs/>
+          <w:b/>
+        </w:rPr>
+        <w:t xml:space="preserve">connections or flows</w:t>
+      </w:r>
+      <w:r>
+        <w:t xml:space="preserve">: every packet of one TCP connection goes to the same backend. An</w:t>
+      </w:r>
+      <w:r>
+        <w:t xml:space="preserve"> </w:t>
+      </w:r>
+      <w:r>
+        <w:rPr>
+          <w:bCs/>
+          <w:b/>
+        </w:rPr>
+        <w:t xml:space="preserve">L7 load balancer</w:t>
+      </w:r>
+      <w:r>
+        <w:t xml:space="preserve"> </w:t>
+      </w:r>
+      <w:r>
+        <w:t xml:space="preserve">terminates the client connection, parses the application protocol (usually HTTP), and balances</w:t>
+      </w:r>
+      <w:r>
+        <w:t xml:space="preserve"> </w:t>
+      </w:r>
+      <w:r>
+        <w:rPr>
+          <w:bCs/>
+          <w:b/>
+        </w:rPr>
+        <w:t xml:space="preserve">requests</w:t>
+      </w:r>
+      <w:r>
+        <w:t xml:space="preserve">: two requests on one connection may go to different backends.</w:t>
+      </w:r>
+      <w:r>
+        <w:t xml:space="preserve"> </w:t>
+      </w:r>
+      <w:r>
+        <w:rPr>
+          <w:iCs/>
+          <w:i/>
+        </w:rPr>
+        <w:t xml:space="preserve">(§19.3.1)</w:t>
+      </w:r>
+    </w:p>
+    <w:p>
+      <w:pPr>
+        <w:pStyle w:val="BodyText"/>
+      </w:pPr>
+      <w:r>
+        <w:rPr>
+          <w:bCs/>
+          <w:b/>
+        </w:rPr>
         <w:t xml:space="preserve">Leaf–spine (folded Clos) network</w:t>
       </w:r>
       <w:r>
@@ -7841,6 +9865,247 @@
           <w:i/>
         </w:rPr>
         <w:t xml:space="preserve">(§7.17.1)</w:t>
+      </w:r>
+    </w:p>
+    <w:p>
+      <w:pPr>
+        <w:pStyle w:val="BodyText"/>
+      </w:pPr>
+      <w:r>
+        <w:rPr>
+          <w:bCs/>
+          <w:b/>
+        </w:rPr>
+        <w:t xml:space="preserve">Leaky bucket</w:t>
+      </w:r>
+      <w:r>
+        <w:t xml:space="preserve"> </w:t>
+      </w:r>
+      <w:r>
+        <w:t xml:space="preserve">— (a)</w:t>
+      </w:r>
+      <w:r>
+        <w:t xml:space="preserve"> </w:t>
+      </w:r>
+      <w:r>
+        <w:rPr>
+          <w:bCs/>
+          <w:b/>
+        </w:rPr>
+        <w:t xml:space="preserve">As a queue:</w:t>
+      </w:r>
+      <w:r>
+        <w:t xml:space="preserve"> </w:t>
+      </w:r>
+      <w:r>
+        <w:t xml:space="preserve">requests enter a FIFO buffer of capacity</w:t>
+      </w:r>
+      <w:r>
+        <w:t xml:space="preserve"> </w:t>
+      </w:r>
+      <m:oMath>
+        <m:r>
+          <m:t>Q</m:t>
+        </m:r>
+      </m:oMath>
+      <w:r>
+        <w:t xml:space="preserve"> </w:t>
+      </w:r>
+      <w:r>
+        <w:t xml:space="preserve">that is drained at a constant rate</w:t>
+      </w:r>
+      <w:r>
+        <w:t xml:space="preserve"> </w:t>
+      </w:r>
+      <m:oMath>
+        <m:r>
+          <m:t>r</m:t>
+        </m:r>
+      </m:oMath>
+      <w:r>
+        <w:t xml:space="preserve">; arrivals that find the buffer full are dropped. Output is perfectly smooth. (b)</w:t>
+      </w:r>
+      <w:r>
+        <w:t xml:space="preserve"> </w:t>
+      </w:r>
+      <w:r>
+        <w:rPr>
+          <w:bCs/>
+          <w:b/>
+        </w:rPr>
+        <w:t xml:space="preserve">As a meter:</w:t>
+      </w:r>
+      <w:r>
+        <w:t xml:space="preserve"> </w:t>
+      </w:r>
+      <w:r>
+        <w:t xml:space="preserve">a counter (the</w:t>
+      </w:r>
+      <w:r>
+        <w:t xml:space="preserve"> </w:t>
+      </w:r>
+      <w:r>
+        <w:t xml:space="preserve">“</w:t>
+      </w:r>
+      <w:r>
+        <w:t xml:space="preserve">water level</w:t>
+      </w:r>
+      <w:r>
+        <w:t xml:space="preserve">”</w:t>
+      </w:r>
+      <w:r>
+        <w:t xml:space="preserve">) increases by one per admitted request and leaks at rate</w:t>
+      </w:r>
+      <w:r>
+        <w:t xml:space="preserve"> </w:t>
+      </w:r>
+      <m:oMath>
+        <m:r>
+          <m:t>r</m:t>
+        </m:r>
+      </m:oMath>
+      <w:r>
+        <w:t xml:space="preserve">; a request that would overflow capacity is rejected immediately. The meter form makes the same admit/reject decisions as a token bucket with the same rate and capacity.</w:t>
+      </w:r>
+      <w:r>
+        <w:t xml:space="preserve"> </w:t>
+      </w:r>
+      <w:r>
+        <w:rPr>
+          <w:iCs/>
+          <w:i/>
+        </w:rPr>
+        <w:t xml:space="preserve">(§22.5.1)</w:t>
+      </w:r>
+    </w:p>
+    <w:p>
+      <w:pPr>
+        <w:pStyle w:val="BodyText"/>
+      </w:pPr>
+      <w:r>
+        <w:rPr>
+          <w:bCs/>
+          <w:b/>
+        </w:rPr>
+        <w:t xml:space="preserve">Least connections</w:t>
+      </w:r>
+      <w:r>
+        <w:t xml:space="preserve"> </w:t>
+      </w:r>
+      <w:r>
+        <w:t xml:space="preserve">— Send each new connection or request to the backend with the fewest</w:t>
+      </w:r>
+      <w:r>
+        <w:t xml:space="preserve"> </w:t>
+      </w:r>
+      <w:r>
+        <w:rPr>
+          <w:bCs/>
+          <w:b/>
+        </w:rPr>
+        <w:t xml:space="preserve">active</w:t>
+      </w:r>
+      <w:r>
+        <w:t xml:space="preserve"> </w:t>
+      </w:r>
+      <w:r>
+        <w:t xml:space="preserve">(in-flight) connections or requests, as counted by the balancer.</w:t>
+      </w:r>
+      <w:r>
+        <w:t xml:space="preserve"> </w:t>
+      </w:r>
+      <w:r>
+        <w:rPr>
+          <w:iCs/>
+          <w:i/>
+        </w:rPr>
+        <w:t xml:space="preserve">Weighted least connections</w:t>
+      </w:r>
+      <w:r>
+        <w:t xml:space="preserve"> </w:t>
+      </w:r>
+      <w:r>
+        <w:t xml:space="preserve">divides each count by the backend’s weight. Envoy calls the request-counting variant</w:t>
+      </w:r>
+      <w:r>
+        <w:t xml:space="preserve"> </w:t>
+      </w:r>
+      <w:r>
+        <w:rPr>
+          <w:bCs/>
+          <w:b/>
+        </w:rPr>
+        <w:t xml:space="preserve">least request</w:t>
+      </w:r>
+      <w:r>
+        <w:t xml:space="preserve">; AWS ALB calls it</w:t>
+      </w:r>
+      <w:r>
+        <w:t xml:space="preserve"> </w:t>
+      </w:r>
+      <w:r>
+        <w:rPr>
+          <w:bCs/>
+          <w:b/>
+        </w:rPr>
+        <w:t xml:space="preserve">least outstanding requests</w:t>
+      </w:r>
+      <w:r>
+        <w:t xml:space="preserve">.</w:t>
+      </w:r>
+      <w:r>
+        <w:t xml:space="preserve"> </w:t>
+      </w:r>
+      <w:r>
+        <w:rPr>
+          <w:iCs/>
+          <w:i/>
+        </w:rPr>
+        <w:t xml:space="preserve">(§19.4.2)</w:t>
+      </w:r>
+    </w:p>
+    <w:p>
+      <w:pPr>
+        <w:pStyle w:val="BodyText"/>
+      </w:pPr>
+      <w:r>
+        <w:rPr>
+          <w:bCs/>
+          <w:b/>
+        </w:rPr>
+        <w:t xml:space="preserve">Least response time</w:t>
+      </w:r>
+      <w:r>
+        <w:t xml:space="preserve"> </w:t>
+      </w:r>
+      <w:r>
+        <w:t xml:space="preserve">— Choose the backend with the lowest recent latency, usually an</w:t>
+      </w:r>
+      <w:r>
+        <w:t xml:space="preserve"> </w:t>
+      </w:r>
+      <w:r>
+        <w:rPr>
+          <w:bCs/>
+          <w:b/>
+        </w:rPr>
+        <w:t xml:space="preserve">exponentially weighted moving average (EWMA)</w:t>
+      </w:r>
+      <w:r>
+        <w:t xml:space="preserve"> </w:t>
+      </w:r>
+      <w:r>
+        <w:t xml:space="preserve">of observed response times, often multiplied by the in-flight count so that both queue length and speed count.</w:t>
+      </w:r>
+      <w:r>
+        <w:t xml:space="preserve"> </w:t>
+      </w:r>
+      <w:r>
+        <w:rPr>
+          <w:iCs/>
+          <w:i/>
+        </w:rPr>
+        <w:t xml:space="preserve">(§19.4.3)</w:t>
       </w:r>
     </w:p>
     <w:p>
@@ -7895,6 +10160,226 @@
           <w:i/>
         </w:rPr>
         <w:t xml:space="preserve">(§4.11.1)</w:t>
+      </w:r>
+    </w:p>
+    <w:p>
+      <w:pPr>
+        <w:pStyle w:val="BodyText"/>
+      </w:pPr>
+      <w:r>
+        <w:rPr>
+          <w:bCs/>
+          <w:b/>
+        </w:rPr>
+        <w:t xml:space="preserve">Load balancer</w:t>
+      </w:r>
+      <w:r>
+        <w:t xml:space="preserve"> </w:t>
+      </w:r>
+      <w:r>
+        <w:t xml:space="preserve">— A component that receives traffic addressed to a single service endpoint, the</w:t>
+      </w:r>
+      <w:r>
+        <w:t xml:space="preserve"> </w:t>
+      </w:r>
+      <w:r>
+        <w:rPr>
+          <w:bCs/>
+          <w:b/>
+        </w:rPr>
+        <w:t xml:space="preserve">virtual IP address (VIP)</w:t>
+      </w:r>
+      <w:r>
+        <w:t xml:space="preserve"> </w:t>
+      </w:r>
+      <w:r>
+        <w:t xml:space="preserve">or service name, and distributes it across a</w:t>
+      </w:r>
+      <w:r>
+        <w:t xml:space="preserve"> </w:t>
+      </w:r>
+      <w:r>
+        <w:rPr>
+          <w:bCs/>
+          <w:b/>
+        </w:rPr>
+        <w:t xml:space="preserve">pool</w:t>
+      </w:r>
+      <w:r>
+        <w:t xml:space="preserve"> </w:t>
+      </w:r>
+      <w:r>
+        <w:t xml:space="preserve">of</w:t>
+      </w:r>
+      <w:r>
+        <w:t xml:space="preserve"> </w:t>
+      </w:r>
+      <w:r>
+        <w:rPr>
+          <w:bCs/>
+          <w:b/>
+        </w:rPr>
+        <w:t xml:space="preserve">backends</w:t>
+      </w:r>
+      <w:r>
+        <w:t xml:space="preserve"> </w:t>
+      </w:r>
+      <w:r>
+        <w:t xml:space="preserve">(also called</w:t>
+      </w:r>
+      <w:r>
+        <w:t xml:space="preserve"> </w:t>
+      </w:r>
+      <w:r>
+        <w:rPr>
+          <w:iCs/>
+          <w:i/>
+        </w:rPr>
+        <w:t xml:space="preserve">upstreams</w:t>
+      </w:r>
+      <w:r>
+        <w:t xml:space="preserve">,</w:t>
+      </w:r>
+      <w:r>
+        <w:t xml:space="preserve"> </w:t>
+      </w:r>
+      <w:r>
+        <w:rPr>
+          <w:iCs/>
+          <w:i/>
+        </w:rPr>
+        <w:t xml:space="preserve">targets</w:t>
+      </w:r>
+      <w:r>
+        <w:t xml:space="preserve"> </w:t>
+      </w:r>
+      <w:r>
+        <w:t xml:space="preserve">or</w:t>
+      </w:r>
+      <w:r>
+        <w:t xml:space="preserve"> </w:t>
+      </w:r>
+      <w:r>
+        <w:rPr>
+          <w:iCs/>
+          <w:i/>
+        </w:rPr>
+        <w:t xml:space="preserve">real servers</w:t>
+      </w:r>
+      <w:r>
+        <w:t xml:space="preserve">) according to a</w:t>
+      </w:r>
+      <w:r>
+        <w:t xml:space="preserve"> </w:t>
+      </w:r>
+      <w:r>
+        <w:rPr>
+          <w:bCs/>
+          <w:b/>
+        </w:rPr>
+        <w:t xml:space="preserve">balancing algorithm</w:t>
+      </w:r>
+      <w:r>
+        <w:t xml:space="preserve">, while excluding backends that are unhealthy.</w:t>
+      </w:r>
+      <w:r>
+        <w:t xml:space="preserve"> </w:t>
+      </w:r>
+      <w:r>
+        <w:rPr>
+          <w:iCs/>
+          <w:i/>
+        </w:rPr>
+        <w:t xml:space="preserve">(§19.3.1)</w:t>
+      </w:r>
+    </w:p>
+    <w:p>
+      <w:pPr>
+        <w:pStyle w:val="BodyText"/>
+      </w:pPr>
+      <w:r>
+        <w:rPr>
+          <w:bCs/>
+          <w:b/>
+        </w:rPr>
+        <w:t xml:space="preserve">Load shedding and throttling</w:t>
+      </w:r>
+      <w:r>
+        <w:t xml:space="preserve"> </w:t>
+      </w:r>
+      <w:r>
+        <w:t xml:space="preserve">—</w:t>
+      </w:r>
+      <w:r>
+        <w:t xml:space="preserve"> </w:t>
+      </w:r>
+      <w:r>
+        <w:rPr>
+          <w:bCs/>
+          <w:b/>
+        </w:rPr>
+        <w:t xml:space="preserve">Load shedding</w:t>
+      </w:r>
+      <w:r>
+        <w:t xml:space="preserve"> </w:t>
+      </w:r>
+      <w:r>
+        <w:t xml:space="preserve">is a server rejecting some requests early and cheaply (usually with 503) because accepting them would push it past capacity, regardless of whether each client is within its quota.</w:t>
+      </w:r>
+      <w:r>
+        <w:t xml:space="preserve"> </w:t>
+      </w:r>
+      <w:r>
+        <w:rPr>
+          <w:bCs/>
+          <w:b/>
+        </w:rPr>
+        <w:t xml:space="preserve">Throttling</w:t>
+      </w:r>
+      <w:r>
+        <w:t xml:space="preserve"> </w:t>
+      </w:r>
+      <w:r>
+        <w:t xml:space="preserve">is slowing a client down, by delaying or rejecting its requests; rate limiting is the quota-based form.</w:t>
+      </w:r>
+      <w:r>
+        <w:t xml:space="preserve"> </w:t>
+      </w:r>
+      <w:r>
+        <w:rPr>
+          <w:bCs/>
+          <w:b/>
+        </w:rPr>
+        <w:t xml:space="preserve">Goodput</w:t>
+      </w:r>
+      <w:r>
+        <w:t xml:space="preserve"> </w:t>
+      </w:r>
+      <w:r>
+        <w:t xml:space="preserve">is the rate of requests completed</w:t>
+      </w:r>
+      <w:r>
+        <w:t xml:space="preserve"> </w:t>
+      </w:r>
+      <w:r>
+        <w:rPr>
+          <w:iCs/>
+          <w:i/>
+        </w:rPr>
+        <w:t xml:space="preserve">usefully</w:t>
+      </w:r>
+      <w:r>
+        <w:t xml:space="preserve">: correctly and before the client gave up.</w:t>
+      </w:r>
+      <w:r>
+        <w:t xml:space="preserve"> </w:t>
+      </w:r>
+      <w:r>
+        <w:rPr>
+          <w:iCs/>
+          <w:i/>
+        </w:rPr>
+        <w:t xml:space="preserve">(§22.9.1)</w:t>
       </w:r>
     </w:p>
     <w:p>
@@ -8350,6 +10835,92 @@
     <w:p>
       <w:pPr>
         <w:pStyle w:val="FirstParagraph"/>
+      </w:pPr>
+      <w:r>
+        <w:rPr>
+          <w:bCs/>
+          <w:b/>
+        </w:rPr>
+        <w:t xml:space="preserve">Maglev hashing</w:t>
+      </w:r>
+      <w:r>
+        <w:t xml:space="preserve"> </w:t>
+      </w:r>
+      <w:r>
+        <w:t xml:space="preserve">— A consistent-hashing scheme that builds a</w:t>
+      </w:r>
+      <w:r>
+        <w:t xml:space="preserve"> </w:t>
+      </w:r>
+      <w:r>
+        <w:rPr>
+          <w:bCs/>
+          <w:b/>
+        </w:rPr>
+        <w:t xml:space="preserve">lookup table</w:t>
+      </w:r>
+      <w:r>
+        <w:t xml:space="preserve"> </w:t>
+      </w:r>
+      <w:r>
+        <w:t xml:space="preserve">of prime size</w:t>
+      </w:r>
+      <w:r>
+        <w:t xml:space="preserve"> </w:t>
+      </w:r>
+      <m:oMath>
+        <m:r>
+          <m:t>M</m:t>
+        </m:r>
+      </m:oMath>
+      <w:r>
+        <w:t xml:space="preserve"> </w:t>
+      </w:r>
+      <w:r>
+        <w:t xml:space="preserve">in which every entry names a backend. Each backend has its own pseudo-random</w:t>
+      </w:r>
+      <w:r>
+        <w:t xml:space="preserve"> </w:t>
+      </w:r>
+      <w:r>
+        <w:rPr>
+          <w:bCs/>
+          <w:b/>
+        </w:rPr>
+        <w:t xml:space="preserve">preference permutation</w:t>
+      </w:r>
+      <w:r>
+        <w:t xml:space="preserve"> </w:t>
+      </w:r>
+      <w:r>
+        <w:t xml:space="preserve">of table positions; backends take turns claiming their next preferred empty position until the table is full. A packet’s backend is</w:t>
+      </w:r>
+      <w:r>
+        <w:t xml:space="preserve"> </w:t>
+      </w:r>
+      <w:r>
+        <w:rPr>
+          <w:rStyle w:val="VerbatimChar"/>
+        </w:rPr>
+        <w:t xml:space="preserve">table[hash(5-tuple) mod M]</w:t>
+      </w:r>
+      <w:r>
+        <w:t xml:space="preserve">: one array read [Eisenbud et al. 2016].</w:t>
+      </w:r>
+      <w:r>
+        <w:t xml:space="preserve"> </w:t>
+      </w:r>
+      <w:r>
+        <w:rPr>
+          <w:iCs/>
+          <w:i/>
+        </w:rPr>
+        <w:t xml:space="preserve">(§19.4.8)</w:t>
+      </w:r>
+    </w:p>
+    <w:p>
+      <w:pPr>
+        <w:pStyle w:val="BodyText"/>
       </w:pPr>
       <w:r>
         <w:rPr>
@@ -10017,6 +12588,177 @@
           <w:bCs/>
           <w:b/>
         </w:rPr>
+        <w:t xml:space="preserve">Offload ratio</w:t>
+      </w:r>
+      <w:r>
+        <w:t xml:space="preserve"> </w:t>
+      </w:r>
+      <w:r>
+        <w:t xml:space="preserve">— The fraction of traffic a CDN serves without contacting the origin.</w:t>
+      </w:r>
+      <w:r>
+        <w:t xml:space="preserve"> </w:t>
+      </w:r>
+      <w:r>
+        <w:rPr>
+          <w:bCs/>
+          <w:b/>
+        </w:rPr>
+        <w:t xml:space="preserve">Request offload</w:t>
+      </w:r>
+      <w:r>
+        <w:t xml:space="preserve"> </w:t>
+      </w:r>
+      <w:r>
+        <w:t xml:space="preserve">counts requests;</w:t>
+      </w:r>
+      <w:r>
+        <w:t xml:space="preserve"> </w:t>
+      </w:r>
+      <w:r>
+        <w:rPr>
+          <w:bCs/>
+          <w:b/>
+        </w:rPr>
+        <w:t xml:space="preserve">byte offload</w:t>
+      </w:r>
+      <w:r>
+        <w:t xml:space="preserve"> </w:t>
+      </w:r>
+      <w:r>
+        <w:t xml:space="preserve">counts bytes. Both are a cache hit ratio (§20.3) measured at the boundary between the CDN and the origin.</w:t>
+      </w:r>
+      <w:r>
+        <w:t xml:space="preserve"> </w:t>
+      </w:r>
+      <w:r>
+        <w:rPr>
+          <w:iCs/>
+          <w:i/>
+        </w:rPr>
+        <w:t xml:space="preserve">(§21.5.1)</w:t>
+      </w:r>
+    </w:p>
+    <w:p>
+      <w:pPr>
+        <w:pStyle w:val="BodyText"/>
+      </w:pPr>
+      <w:r>
+        <w:rPr>
+          <w:bCs/>
+          <w:b/>
+        </w:rPr>
+        <w:t xml:space="preserve">Open and closed workload models</w:t>
+      </w:r>
+      <w:r>
+        <w:t xml:space="preserve"> </w:t>
+      </w:r>
+      <w:r>
+        <w:t xml:space="preserve">— In an</w:t>
+      </w:r>
+      <w:r>
+        <w:t xml:space="preserve"> </w:t>
+      </w:r>
+      <w:r>
+        <w:rPr>
+          <w:bCs/>
+          <w:b/>
+        </w:rPr>
+        <w:t xml:space="preserve">open</w:t>
+      </w:r>
+      <w:r>
+        <w:t xml:space="preserve"> </w:t>
+      </w:r>
+      <w:r>
+        <w:t xml:space="preserve">model, new requests arrive at a rate that is independent of how fast the system answers: users on the internet do not wait for each other. In a</w:t>
+      </w:r>
+      <w:r>
+        <w:t xml:space="preserve"> </w:t>
+      </w:r>
+      <w:r>
+        <w:rPr>
+          <w:bCs/>
+          <w:b/>
+        </w:rPr>
+        <w:t xml:space="preserve">closed</w:t>
+      </w:r>
+      <w:r>
+        <w:t xml:space="preserve"> </w:t>
+      </w:r>
+      <w:r>
+        <w:t xml:space="preserve">model, a fixed population of</w:t>
+      </w:r>
+      <w:r>
+        <w:t xml:space="preserve"> </w:t>
+      </w:r>
+      <m:oMath>
+        <m:r>
+          <m:t>N</m:t>
+        </m:r>
+      </m:oMath>
+      <w:r>
+        <w:t xml:space="preserve"> </w:t>
+      </w:r>
+      <w:r>
+        <w:t xml:space="preserve">users (or load-generator threads) each sends a request, waits for the response, optionally pauses for a</w:t>
+      </w:r>
+      <w:r>
+        <w:t xml:space="preserve"> </w:t>
+      </w:r>
+      <w:r>
+        <w:rPr>
+          <w:bCs/>
+          <w:b/>
+        </w:rPr>
+        <w:t xml:space="preserve">think time</w:t>
+      </w:r>
+      <w:r>
+        <w:t xml:space="preserve"> </w:t>
+      </w:r>
+      <m:oMath>
+        <m:r>
+          <m:t>Z</m:t>
+        </m:r>
+      </m:oMath>
+      <w:r>
+        <w:t xml:space="preserve">, and only then sends the next. A</w:t>
+      </w:r>
+      <w:r>
+        <w:t xml:space="preserve"> </w:t>
+      </w:r>
+      <w:r>
+        <w:rPr>
+          <w:bCs/>
+          <w:b/>
+        </w:rPr>
+        <w:t xml:space="preserve">partly open</w:t>
+      </w:r>
+      <w:r>
+        <w:t xml:space="preserve"> </w:t>
+      </w:r>
+      <w:r>
+        <w:t xml:space="preserve">model has sessions that arrive openly but issue several requests each, closed-loop, within the session [Schroeder et al. 2006].</w:t>
+      </w:r>
+      <w:r>
+        <w:t xml:space="preserve"> </w:t>
+      </w:r>
+      <w:r>
+        <w:rPr>
+          <w:iCs/>
+          <w:i/>
+        </w:rPr>
+        <w:t xml:space="preserve">(§23.5.2)</w:t>
+      </w:r>
+    </w:p>
+    <w:p>
+      <w:pPr>
+        <w:pStyle w:val="BodyText"/>
+      </w:pPr>
+      <w:r>
+        <w:rPr>
+          <w:bCs/>
+          <w:b/>
+        </w:rPr>
         <w:t xml:space="preserve">OpenAPI Specification (OAS)</w:t>
       </w:r>
       <w:r>
@@ -10166,6 +12908,47 @@
           <w:bCs/>
           <w:b/>
         </w:rPr>
+        <w:t xml:space="preserve">Origin shielding</w:t>
+      </w:r>
+      <w:r>
+        <w:t xml:space="preserve"> </w:t>
+      </w:r>
+      <w:r>
+        <w:t xml:space="preserve">— Routing every cache miss for an origin through one designated cache tier (the</w:t>
+      </w:r>
+      <w:r>
+        <w:t xml:space="preserve"> </w:t>
+      </w:r>
+      <w:r>
+        <w:rPr>
+          <w:bCs/>
+          <w:b/>
+        </w:rPr>
+        <w:t xml:space="preserve">shield</w:t>
+      </w:r>
+      <w:r>
+        <w:t xml:space="preserve">), so that the origin sees at most one request per object per freshness period, regardless of how many edge PoPs missed.</w:t>
+      </w:r>
+      <w:r>
+        <w:t xml:space="preserve"> </w:t>
+      </w:r>
+      <w:r>
+        <w:rPr>
+          <w:iCs/>
+          <w:i/>
+        </w:rPr>
+        <w:t xml:space="preserve">(§21.5.3)</w:t>
+      </w:r>
+    </w:p>
+    <w:p>
+      <w:pPr>
+        <w:pStyle w:val="BodyText"/>
+      </w:pPr>
+      <w:r>
+        <w:rPr>
+          <w:bCs/>
+          <w:b/>
+        </w:rPr>
         <w:t xml:space="preserve">Out-of-order (OoO) execution</w:t>
       </w:r>
       <w:r>
@@ -10756,6 +13539,79 @@
           <w:bCs/>
           <w:b/>
         </w:rPr>
+        <w:t xml:space="preserve">Performance engineering</w:t>
+      </w:r>
+      <w:r>
+        <w:t xml:space="preserve"> </w:t>
+      </w:r>
+      <w:r>
+        <w:t xml:space="preserve">— The practice of measuring, explaining and improving the</w:t>
+      </w:r>
+      <w:r>
+        <w:t xml:space="preserve"> </w:t>
+      </w:r>
+      <w:r>
+        <w:rPr>
+          <w:bCs/>
+          <w:b/>
+        </w:rPr>
+        <w:t xml:space="preserve">latency</w:t>
+      </w:r>
+      <w:r>
+        <w:t xml:space="preserve">,</w:t>
+      </w:r>
+      <w:r>
+        <w:t xml:space="preserve"> </w:t>
+      </w:r>
+      <w:r>
+        <w:rPr>
+          <w:bCs/>
+          <w:b/>
+        </w:rPr>
+        <w:t xml:space="preserve">throughput</w:t>
+      </w:r>
+      <w:r>
+        <w:t xml:space="preserve"> </w:t>
+      </w:r>
+      <w:r>
+        <w:t xml:space="preserve">and</w:t>
+      </w:r>
+      <w:r>
+        <w:t xml:space="preserve"> </w:t>
+      </w:r>
+      <w:r>
+        <w:rPr>
+          <w:bCs/>
+          <w:b/>
+        </w:rPr>
+        <w:t xml:space="preserve">resource efficiency</w:t>
+      </w:r>
+      <w:r>
+        <w:t xml:space="preserve"> </w:t>
+      </w:r>
+      <w:r>
+        <w:t xml:space="preserve">of a system against explicit targets, using repeatable methods rather than intuition. Its outputs are diagnoses (why is it slow?), changes (make it faster or cheaper) and predictions (how much capacity will we need?).</w:t>
+      </w:r>
+      <w:r>
+        <w:t xml:space="preserve"> </w:t>
+      </w:r>
+      <w:r>
+        <w:rPr>
+          <w:iCs/>
+          <w:i/>
+        </w:rPr>
+        <w:t xml:space="preserve">(§23.3.1)</w:t>
+      </w:r>
+    </w:p>
+    <w:p>
+      <w:pPr>
+        <w:pStyle w:val="BodyText"/>
+      </w:pPr>
+      <w:r>
+        <w:rPr>
+          <w:bCs/>
+          <w:b/>
+        </w:rPr>
         <w:t xml:space="preserve">PKCE (Proof Key for Code Exchange,</w:t>
       </w:r>
       <w:r>
@@ -10845,6 +13701,34 @@
           <w:bCs/>
           <w:b/>
         </w:rPr>
+        <w:t xml:space="preserve">Point of presence (PoP)</w:t>
+      </w:r>
+      <w:r>
+        <w:t xml:space="preserve"> </w:t>
+      </w:r>
+      <w:r>
+        <w:t xml:space="preserve">— A CDN site in one metropolitan area or interconnection facility, containing load balancers, caching proxy servers with RAM and SSD storage, and connections to local networks. Large CDNs operate hundreds of PoPs; some also place servers inside Internet service provider (ISP) networks.</w:t>
+      </w:r>
+      <w:r>
+        <w:t xml:space="preserve"> </w:t>
+      </w:r>
+      <w:r>
+        <w:rPr>
+          <w:iCs/>
+          <w:i/>
+        </w:rPr>
+        <w:t xml:space="preserve">(§21.3.2)</w:t>
+      </w:r>
+    </w:p>
+    <w:p>
+      <w:pPr>
+        <w:pStyle w:val="BodyText"/>
+      </w:pPr>
+      <w:r>
+        <w:rPr>
+          <w:bCs/>
+          <w:b/>
+        </w:rPr>
         <w:t xml:space="preserve">Polyglot persistence</w:t>
       </w:r>
       <w:r>
@@ -10862,6 +13746,50 @@
           <w:i/>
         </w:rPr>
         <w:t xml:space="preserve">(§12.13.1)</w:t>
+      </w:r>
+    </w:p>
+    <w:p>
+      <w:pPr>
+        <w:pStyle w:val="BodyText"/>
+      </w:pPr>
+      <w:r>
+        <w:rPr>
+          <w:bCs/>
+          <w:b/>
+        </w:rPr>
+        <w:t xml:space="preserve">Power of two choices (P2C)</w:t>
+      </w:r>
+      <w:r>
+        <w:t xml:space="preserve"> </w:t>
+      </w:r>
+      <w:r>
+        <w:t xml:space="preserve">— For each request, pick</w:t>
+      </w:r>
+      <w:r>
+        <w:t xml:space="preserve"> </w:t>
+      </w:r>
+      <w:r>
+        <w:rPr>
+          <w:bCs/>
+          <w:b/>
+        </w:rPr>
+        <w:t xml:space="preserve">two</w:t>
+      </w:r>
+      <w:r>
+        <w:t xml:space="preserve"> </w:t>
+      </w:r>
+      <w:r>
+        <w:t xml:space="preserve">backends uniformly at random and send the request to the less loaded of the two (by in-flight count, EWMA latency or another load signal).</w:t>
+      </w:r>
+      <w:r>
+        <w:t xml:space="preserve"> </w:t>
+      </w:r>
+      <w:r>
+        <w:rPr>
+          <w:iCs/>
+          <w:i/>
+        </w:rPr>
+        <w:t xml:space="preserve">(§19.4.4)</w:t>
       </w:r>
     </w:p>
     <w:p>
@@ -11194,6 +14122,66 @@
           <w:i/>
         </w:rPr>
         <w:t xml:space="preserve">(§6.3.4)</w:t>
+      </w:r>
+    </w:p>
+    <w:p>
+      <w:pPr>
+        <w:pStyle w:val="BodyText"/>
+      </w:pPr>
+      <w:r>
+        <w:rPr>
+          <w:bCs/>
+          <w:b/>
+        </w:rPr>
+        <w:t xml:space="preserve">Profiler</w:t>
+      </w:r>
+      <w:r>
+        <w:t xml:space="preserve"> </w:t>
+      </w:r>
+      <w:r>
+        <w:t xml:space="preserve">— A tool that attributes a resource (CPU time, wall-clock time, allocated bytes, lock wait time) to the code locations that consumed it. A</w:t>
+      </w:r>
+      <w:r>
+        <w:t xml:space="preserve"> </w:t>
+      </w:r>
+      <w:r>
+        <w:rPr>
+          <w:bCs/>
+          <w:b/>
+        </w:rPr>
+        <w:t xml:space="preserve">sampling profiler</w:t>
+      </w:r>
+      <w:r>
+        <w:t xml:space="preserve"> </w:t>
+      </w:r>
+      <w:r>
+        <w:t xml:space="preserve">interrupts the program at a fixed frequency and records the current call stack; a function’s share of samples estimates its share of time. An</w:t>
+      </w:r>
+      <w:r>
+        <w:t xml:space="preserve"> </w:t>
+      </w:r>
+      <w:r>
+        <w:rPr>
+          <w:bCs/>
+          <w:b/>
+        </w:rPr>
+        <w:t xml:space="preserve">instrumenting</w:t>
+      </w:r>
+      <w:r>
+        <w:t xml:space="preserve"> </w:t>
+      </w:r>
+      <w:r>
+        <w:t xml:space="preserve">(deterministic, tracing) profiler inserts hooks at every function entry and exit and records exact call counts and durations.</w:t>
+      </w:r>
+      <w:r>
+        <w:t xml:space="preserve"> </w:t>
+      </w:r>
+      <w:r>
+        <w:rPr>
+          <w:iCs/>
+          <w:i/>
+        </w:rPr>
+        <w:t xml:space="preserve">(§23.4.1)</w:t>
       </w:r>
     </w:p>
     <w:p>
@@ -11716,6 +14704,126 @@
           <w:bCs/>
           <w:b/>
         </w:rPr>
+        <w:t xml:space="preserve">Rate limiting</w:t>
+      </w:r>
+      <w:r>
+        <w:t xml:space="preserve"> </w:t>
+      </w:r>
+      <w:r>
+        <w:t xml:space="preserve">— Enforcing an upper bound on how many requests (or how much work) a given</w:t>
+      </w:r>
+      <w:r>
+        <w:t xml:space="preserve"> </w:t>
+      </w:r>
+      <w:r>
+        <w:rPr>
+          <w:bCs/>
+          <w:b/>
+        </w:rPr>
+        <w:t xml:space="preserve">client identity</w:t>
+      </w:r>
+      <w:r>
+        <w:t xml:space="preserve"> </w:t>
+      </w:r>
+      <w:r>
+        <w:t xml:space="preserve">may submit to a resource over time. Requests beyond the bound are rejected (or, less often, delayed). The bound is usually stated as a</w:t>
+      </w:r>
+      <w:r>
+        <w:t xml:space="preserve"> </w:t>
+      </w:r>
+      <w:r>
+        <w:rPr>
+          <w:bCs/>
+          <w:b/>
+        </w:rPr>
+        <w:t xml:space="preserve">rate</w:t>
+      </w:r>
+      <w:r>
+        <w:t xml:space="preserve"> </w:t>
+      </w:r>
+      <w:r>
+        <w:t xml:space="preserve">(for example 100 requests per minute) plus a</w:t>
+      </w:r>
+      <w:r>
+        <w:t xml:space="preserve"> </w:t>
+      </w:r>
+      <w:r>
+        <w:rPr>
+          <w:bCs/>
+          <w:b/>
+        </w:rPr>
+        <w:t xml:space="preserve">burst</w:t>
+      </w:r>
+      <w:r>
+        <w:t xml:space="preserve"> </w:t>
+      </w:r>
+      <w:r>
+        <w:t xml:space="preserve">allowance.</w:t>
+      </w:r>
+      <w:r>
+        <w:t xml:space="preserve"> </w:t>
+      </w:r>
+      <w:r>
+        <w:rPr>
+          <w:iCs/>
+          <w:i/>
+        </w:rPr>
+        <w:t xml:space="preserve">(§22.3.1)</w:t>
+      </w:r>
+    </w:p>
+    <w:p>
+      <w:pPr>
+        <w:pStyle w:val="BodyText"/>
+      </w:pPr>
+      <w:r>
+        <w:rPr>
+          <w:bCs/>
+          <w:b/>
+        </w:rPr>
+        <w:t xml:space="preserve">Read-through</w:t>
+      </w:r>
+      <w:r>
+        <w:t xml:space="preserve"> </w:t>
+      </w:r>
+      <w:r>
+        <w:t xml:space="preserve">— The application asks only the cache; on a miss the</w:t>
+      </w:r>
+      <w:r>
+        <w:t xml:space="preserve"> </w:t>
+      </w:r>
+      <w:r>
+        <w:rPr>
+          <w:iCs/>
+          <w:i/>
+        </w:rPr>
+        <w:t xml:space="preserve">cache</w:t>
+      </w:r>
+      <w:r>
+        <w:t xml:space="preserve"> </w:t>
+      </w:r>
+      <w:r>
+        <w:t xml:space="preserve">loads the value from the database through a configured loader, stores it and returns it.</w:t>
+      </w:r>
+      <w:r>
+        <w:t xml:space="preserve"> </w:t>
+      </w:r>
+      <w:r>
+        <w:rPr>
+          <w:iCs/>
+          <w:i/>
+        </w:rPr>
+        <w:t xml:space="preserve">(§20.7.3)</w:t>
+      </w:r>
+    </w:p>
+    <w:p>
+      <w:pPr>
+        <w:pStyle w:val="BodyText"/>
+      </w:pPr>
+      <w:r>
+        <w:rPr>
+          <w:bCs/>
+          <w:b/>
+        </w:rPr>
         <w:t xml:space="preserve">Read-your-writes consistency</w:t>
       </w:r>
       <w:r>
@@ -11761,6 +14869,86 @@
           <w:i/>
         </w:rPr>
         <w:t xml:space="preserve">(§14.9.1)</w:t>
+      </w:r>
+    </w:p>
+    <w:p>
+      <w:pPr>
+        <w:pStyle w:val="BodyText"/>
+      </w:pPr>
+      <w:r>
+        <w:rPr>
+          <w:bCs/>
+          <w:b/>
+        </w:rPr>
+        <w:t xml:space="preserve">RED method</w:t>
+      </w:r>
+      <w:r>
+        <w:t xml:space="preserve"> </w:t>
+      </w:r>
+      <w:r>
+        <w:t xml:space="preserve">— For every</w:t>
+      </w:r>
+      <w:r>
+        <w:t xml:space="preserve"> </w:t>
+      </w:r>
+      <w:r>
+        <w:rPr>
+          <w:bCs/>
+          <w:b/>
+        </w:rPr>
+        <w:t xml:space="preserve">service</w:t>
+      </w:r>
+      <w:r>
+        <w:t xml:space="preserve">, monitor</w:t>
+      </w:r>
+      <w:r>
+        <w:t xml:space="preserve"> </w:t>
+      </w:r>
+      <w:r>
+        <w:rPr>
+          <w:bCs/>
+          <w:b/>
+        </w:rPr>
+        <w:t xml:space="preserve">R</w:t>
+      </w:r>
+      <w:r>
+        <w:t xml:space="preserve">ate (requests per second),</w:t>
+      </w:r>
+      <w:r>
+        <w:t xml:space="preserve"> </w:t>
+      </w:r>
+      <w:r>
+        <w:rPr>
+          <w:bCs/>
+          <w:b/>
+        </w:rPr>
+        <w:t xml:space="preserve">E</w:t>
+      </w:r>
+      <w:r>
+        <w:t xml:space="preserve">rrors (failed requests per second) and</w:t>
+      </w:r>
+      <w:r>
+        <w:t xml:space="preserve"> </w:t>
+      </w:r>
+      <w:r>
+        <w:rPr>
+          <w:bCs/>
+          <w:b/>
+        </w:rPr>
+        <w:t xml:space="preserve">D</w:t>
+      </w:r>
+      <w:r>
+        <w:t xml:space="preserve">uration (the distribution of request latency, as a histogram from which percentiles are read). Tom Wilkie proposed it while at Weaveworks as a service-level complement to USE [Wilkie 2018].</w:t>
+      </w:r>
+      <w:r>
+        <w:t xml:space="preserve"> </w:t>
+      </w:r>
+      <w:r>
+        <w:rPr>
+          <w:iCs/>
+          <w:i/>
+        </w:rPr>
+        <w:t xml:space="preserve">(§23.3.3)</w:t>
       </w:r>
     </w:p>
     <w:p>
@@ -12774,6 +15962,185 @@
           <w:bCs/>
           <w:b/>
         </w:rPr>
+        <w:t xml:space="preserve">Round robin (RR)</w:t>
+      </w:r>
+      <w:r>
+        <w:t xml:space="preserve"> </w:t>
+      </w:r>
+      <w:r>
+        <w:t xml:space="preserve">— Send the</w:t>
+      </w:r>
+      <w:r>
+        <w:t xml:space="preserve"> </w:t>
+      </w:r>
+      <m:oMath>
+        <m:r>
+          <m:t>k</m:t>
+        </m:r>
+      </m:oMath>
+      <w:r>
+        <w:t xml:space="preserve">-th request to backend</w:t>
+      </w:r>
+      <w:r>
+        <w:t xml:space="preserve"> </w:t>
+      </w:r>
+      <m:oMath>
+        <m:r>
+          <m:t>k</m:t>
+        </m:r>
+        <m:r>
+          <m:t> </m:t>
+        </m:r>
+        <m:r>
+          <m:rPr>
+            <m:sty m:val="p"/>
+          </m:rPr>
+          <m:t>mod</m:t>
+        </m:r>
+        <m:r>
+          <m:t> </m:t>
+        </m:r>
+        <m:r>
+          <m:t>N</m:t>
+        </m:r>
+      </m:oMath>
+      <w:r>
+        <w:t xml:space="preserve">.</w:t>
+      </w:r>
+      <w:r>
+        <w:t xml:space="preserve"> </w:t>
+      </w:r>
+      <w:r>
+        <w:rPr>
+          <w:bCs/>
+          <w:b/>
+        </w:rPr>
+        <w:t xml:space="preserve">Weighted round robin (WRR)</w:t>
+      </w:r>
+      <w:r>
+        <w:t xml:space="preserve"> </w:t>
+      </w:r>
+      <w:r>
+        <w:t xml:space="preserve">gives backend</w:t>
+      </w:r>
+      <w:r>
+        <w:t xml:space="preserve"> </w:t>
+      </w:r>
+      <m:oMath>
+        <m:r>
+          <m:t>i</m:t>
+        </m:r>
+      </m:oMath>
+      <w:r>
+        <w:t xml:space="preserve"> </w:t>
+      </w:r>
+      <w:r>
+        <w:t xml:space="preserve">an integer weight</w:t>
+      </w:r>
+      <w:r>
+        <w:t xml:space="preserve"> </w:t>
+      </w:r>
+      <m:oMath>
+        <m:sSub>
+          <m:e>
+            <m:r>
+              <m:t>w</m:t>
+            </m:r>
+          </m:e>
+          <m:sub>
+            <m:r>
+              <m:t>i</m:t>
+            </m:r>
+          </m:sub>
+        </m:sSub>
+      </m:oMath>
+      <w:r>
+        <w:t xml:space="preserve"> </w:t>
+      </w:r>
+      <w:r>
+        <w:t xml:space="preserve">and sends it a share</w:t>
+      </w:r>
+      <w:r>
+        <w:t xml:space="preserve"> </w:t>
+      </w:r>
+      <m:oMath>
+        <m:sSub>
+          <m:e>
+            <m:r>
+              <m:t>w</m:t>
+            </m:r>
+          </m:e>
+          <m:sub>
+            <m:r>
+              <m:t>i</m:t>
+            </m:r>
+          </m:sub>
+        </m:sSub>
+        <m:r>
+          <m:rPr>
+            <m:sty m:val="p"/>
+          </m:rPr>
+          <m:t>/</m:t>
+        </m:r>
+        <m:nary>
+          <m:naryPr>
+            <m:chr m:val="∑"/>
+            <m:limLoc m:val="undOvr"/>
+            <m:subHide m:val="off"/>
+            <m:supHide m:val="on"/>
+          </m:naryPr>
+          <m:sub>
+            <m:r>
+              <m:t>j</m:t>
+            </m:r>
+          </m:sub>
+          <m:sup>
+            <m:r>
+              <m:t>​</m:t>
+            </m:r>
+          </m:sup>
+          <m:e>
+            <m:sSub>
+              <m:e>
+                <m:r>
+                  <m:t>w</m:t>
+                </m:r>
+              </m:e>
+              <m:sub>
+                <m:r>
+                  <m:t>j</m:t>
+                </m:r>
+              </m:sub>
+            </m:sSub>
+          </m:e>
+        </m:nary>
+      </m:oMath>
+      <w:r>
+        <w:t xml:space="preserve"> </w:t>
+      </w:r>
+      <w:r>
+        <w:t xml:space="preserve">of requests in each cycle.</w:t>
+      </w:r>
+      <w:r>
+        <w:t xml:space="preserve"> </w:t>
+      </w:r>
+      <w:r>
+        <w:rPr>
+          <w:iCs/>
+          <w:i/>
+        </w:rPr>
+        <w:t xml:space="preserve">(§19.4.1)</w:t>
+      </w:r>
+    </w:p>
+    <w:p>
+      <w:pPr>
+        <w:pStyle w:val="BodyText"/>
+      </w:pPr>
+      <w:r>
+        <w:rPr>
+          <w:bCs/>
+          <w:b/>
+        </w:rPr>
         <w:t xml:space="preserve">Routing and forwarding</w:t>
       </w:r>
       <w:r>
@@ -12952,6 +16319,161 @@
           <w:bCs/>
           <w:b/>
         </w:rPr>
+        <w:t xml:space="preserve">Scalability</w:t>
+      </w:r>
+      <w:r>
+        <w:t xml:space="preserve"> </w:t>
+      </w:r>
+      <w:r>
+        <w:t xml:space="preserve">— The ability of a system to handle a growing workload by adding resources, with throughput rising roughly in proportion to the resources added and latency staying within its objective. A system is</w:t>
+      </w:r>
+      <w:r>
+        <w:t xml:space="preserve"> </w:t>
+      </w:r>
+      <w:r>
+        <w:rPr>
+          <w:iCs/>
+          <w:i/>
+        </w:rPr>
+        <w:t xml:space="preserve">not</w:t>
+      </w:r>
+      <w:r>
+        <w:t xml:space="preserve"> </w:t>
+      </w:r>
+      <w:r>
+        <w:t xml:space="preserve">scalable for a workload if adding resources yields little or no extra throughput, or if the cost per unit of work rises sharply.</w:t>
+      </w:r>
+      <w:r>
+        <w:t xml:space="preserve"> </w:t>
+      </w:r>
+      <w:r>
+        <w:rPr>
+          <w:iCs/>
+          <w:i/>
+        </w:rPr>
+        <w:t xml:space="preserve">(§18.3.1)</w:t>
+      </w:r>
+    </w:p>
+    <w:p>
+      <w:pPr>
+        <w:pStyle w:val="BodyText"/>
+      </w:pPr>
+      <w:r>
+        <w:rPr>
+          <w:bCs/>
+          <w:b/>
+        </w:rPr>
+        <w:t xml:space="preserve">Scale cube</w:t>
+      </w:r>
+      <w:r>
+        <w:t xml:space="preserve"> </w:t>
+      </w:r>
+      <w:r>
+        <w:t xml:space="preserve">— A model by Martin Abbott and Michael Fisher that classifies every scaling technique along three independent axes [Abbott and Fisher 2015]: the</w:t>
+      </w:r>
+      <w:r>
+        <w:t xml:space="preserve"> </w:t>
+      </w:r>
+      <w:r>
+        <w:rPr>
+          <w:bCs/>
+          <w:b/>
+        </w:rPr>
+        <w:t xml:space="preserve">X axis</w:t>
+      </w:r>
+      <w:r>
+        <w:t xml:space="preserve">, cloning identical copies of a service or its data behind a load balancer; the</w:t>
+      </w:r>
+      <w:r>
+        <w:t xml:space="preserve"> </w:t>
+      </w:r>
+      <w:r>
+        <w:rPr>
+          <w:bCs/>
+          <w:b/>
+        </w:rPr>
+        <w:t xml:space="preserve">Y axis</w:t>
+      </w:r>
+      <w:r>
+        <w:t xml:space="preserve">, splitting by function, service or resource so that each part handles different work; and the</w:t>
+      </w:r>
+      <w:r>
+        <w:t xml:space="preserve"> </w:t>
+      </w:r>
+      <w:r>
+        <w:rPr>
+          <w:bCs/>
+          <w:b/>
+        </w:rPr>
+        <w:t xml:space="preserve">Z axis</w:t>
+      </w:r>
+      <w:r>
+        <w:t xml:space="preserve">, splitting by customer, requester or other key so that each part handles the same work for a subset of the data or users.</w:t>
+      </w:r>
+      <w:r>
+        <w:t xml:space="preserve"> </w:t>
+      </w:r>
+      <w:r>
+        <w:rPr>
+          <w:iCs/>
+          <w:i/>
+        </w:rPr>
+        <w:t xml:space="preserve">(§18.10.1)</w:t>
+      </w:r>
+    </w:p>
+    <w:p>
+      <w:pPr>
+        <w:pStyle w:val="BodyText"/>
+      </w:pPr>
+      <w:r>
+        <w:rPr>
+          <w:bCs/>
+          <w:b/>
+        </w:rPr>
+        <w:t xml:space="preserve">Scaling bottleneck</w:t>
+      </w:r>
+      <w:r>
+        <w:t xml:space="preserve"> </w:t>
+      </w:r>
+      <w:r>
+        <w:t xml:space="preserve">— The resource that limits throughput as load or node count grows: the resource with the largest service demand per unit of capacity (§2.6). For a horizontally scaled system, it is usually a resource that</w:t>
+      </w:r>
+      <w:r>
+        <w:t xml:space="preserve"> </w:t>
+      </w:r>
+      <w:r>
+        <w:rPr>
+          <w:iCs/>
+          <w:i/>
+        </w:rPr>
+        <w:t xml:space="preserve">all</w:t>
+      </w:r>
+      <w:r>
+        <w:t xml:space="preserve"> </w:t>
+      </w:r>
+      <w:r>
+        <w:t xml:space="preserve">nodes share and that cannot itself be scaled out by adding application nodes.</w:t>
+      </w:r>
+      <w:r>
+        <w:t xml:space="preserve"> </w:t>
+      </w:r>
+      <w:r>
+        <w:rPr>
+          <w:iCs/>
+          <w:i/>
+        </w:rPr>
+        <w:t xml:space="preserve">(§18.7.1)</w:t>
+      </w:r>
+    </w:p>
+    <w:p>
+      <w:pPr>
+        <w:pStyle w:val="BodyText"/>
+      </w:pPr>
+      <w:r>
+        <w:rPr>
+          <w:bCs/>
+          <w:b/>
+        </w:rPr>
         <w:t xml:space="preserve">Search engine (as a data store)</w:t>
       </w:r>
       <w:r>
@@ -13473,6 +16995,34 @@
           <w:i/>
         </w:rPr>
         <w:t xml:space="preserve">(§8.10.2)</w:t>
+      </w:r>
+    </w:p>
+    <w:p>
+      <w:pPr>
+        <w:pStyle w:val="BodyText"/>
+      </w:pPr>
+      <w:r>
+        <w:rPr>
+          <w:bCs/>
+          <w:b/>
+        </w:rPr>
+        <w:t xml:space="preserve">Session affinity (sticky sessions)</w:t>
+      </w:r>
+      <w:r>
+        <w:t xml:space="preserve"> </w:t>
+      </w:r>
+      <w:r>
+        <w:t xml:space="preserve">— A balancer policy that sends all requests of one client session to the same backend, identified by a cookie, the client’s IP address or a request key.</w:t>
+      </w:r>
+      <w:r>
+        <w:t xml:space="preserve"> </w:t>
+      </w:r>
+      <w:r>
+        <w:rPr>
+          <w:iCs/>
+          <w:i/>
+        </w:rPr>
+        <w:t xml:space="preserve">(§19.6)</w:t>
       </w:r>
     </w:p>
     <w:p>
@@ -13921,6 +17471,131 @@
           <w:i/>
         </w:rPr>
         <w:t xml:space="preserve">(§17.7.1)</w:t>
+      </w:r>
+    </w:p>
+    <w:p>
+      <w:pPr>
+        <w:pStyle w:val="BodyText"/>
+      </w:pPr>
+      <w:r>
+        <w:rPr>
+          <w:bCs/>
+          <w:b/>
+        </w:rPr>
+        <w:t xml:space="preserve">Sliding window counter</w:t>
+      </w:r>
+      <w:r>
+        <w:t xml:space="preserve"> </w:t>
+      </w:r>
+      <w:r>
+        <w:t xml:space="preserve">— A limiter that keeps fixed-window counters for the current and previous windows and estimates the count over the last</w:t>
+      </w:r>
+      <w:r>
+        <w:t xml:space="preserve"> </w:t>
+      </w:r>
+      <m:oMath>
+        <m:r>
+          <m:t>W</m:t>
+        </m:r>
+      </m:oMath>
+      <w:r>
+        <w:t xml:space="preserve"> </w:t>
+      </w:r>
+      <w:r>
+        <w:t xml:space="preserve">seconds by weighting the previous window’s count by the fraction of it that still overlaps the sliding interval.</w:t>
+      </w:r>
+      <w:r>
+        <w:t xml:space="preserve"> </w:t>
+      </w:r>
+      <w:r>
+        <w:rPr>
+          <w:iCs/>
+          <w:i/>
+        </w:rPr>
+        <w:t xml:space="preserve">(§22.7.2)</w:t>
+      </w:r>
+    </w:p>
+    <w:p>
+      <w:pPr>
+        <w:pStyle w:val="BodyText"/>
+      </w:pPr>
+      <w:r>
+        <w:rPr>
+          <w:bCs/>
+          <w:b/>
+        </w:rPr>
+        <w:t xml:space="preserve">Sliding window log</w:t>
+      </w:r>
+      <w:r>
+        <w:t xml:space="preserve"> </w:t>
+      </w:r>
+      <w:r>
+        <w:t xml:space="preserve">— A limiter that stores the timestamp of every admitted request per key and admits a new request only if fewer than</w:t>
+      </w:r>
+      <w:r>
+        <w:t xml:space="preserve"> </w:t>
+      </w:r>
+      <m:oMath>
+        <m:r>
+          <m:t>L</m:t>
+        </m:r>
+      </m:oMath>
+      <w:r>
+        <w:t xml:space="preserve"> </w:t>
+      </w:r>
+      <w:r>
+        <w:t xml:space="preserve">timestamps fall in the interval</w:t>
+      </w:r>
+      <w:r>
+        <w:t xml:space="preserve"> </w:t>
+      </w:r>
+      <m:oMath>
+        <m:r>
+          <m:rPr>
+            <m:sty m:val="p"/>
+          </m:rPr>
+          <m:t>(</m:t>
+        </m:r>
+        <m:r>
+          <m:t>t</m:t>
+        </m:r>
+        <m:r>
+          <m:rPr>
+            <m:sty m:val="p"/>
+          </m:rPr>
+          <m:t>−</m:t>
+        </m:r>
+        <m:r>
+          <m:t>W</m:t>
+        </m:r>
+        <m:r>
+          <m:rPr>
+            <m:sty m:val="p"/>
+          </m:rPr>
+          <m:t>,</m:t>
+        </m:r>
+        <m:r>
+          <m:t>t</m:t>
+        </m:r>
+        <m:r>
+          <m:rPr>
+            <m:sty m:val="p"/>
+          </m:rPr>
+          <m:t>]</m:t>
+        </m:r>
+      </m:oMath>
+      <w:r>
+        <w:t xml:space="preserve">.</w:t>
+      </w:r>
+      <w:r>
+        <w:t xml:space="preserve"> </w:t>
+      </w:r>
+      <w:r>
+        <w:rPr>
+          <w:iCs/>
+          <w:i/>
+        </w:rPr>
+        <w:t xml:space="preserve">(§22.7.1)</w:t>
       </w:r>
     </w:p>
     <w:p>
@@ -14456,6 +18131,34 @@
           <w:bCs/>
           <w:b/>
         </w:rPr>
+        <w:t xml:space="preserve">Stateful service</w:t>
+      </w:r>
+      <w:r>
+        <w:t xml:space="preserve"> </w:t>
+      </w:r>
+      <w:r>
+        <w:t xml:space="preserve">— A service whose instances hold data that must survive between requests and that clients or other instances depend on: a database, a cache node, a WebSocket server holding live connections, or an application server keeping sessions in memory.</w:t>
+      </w:r>
+      <w:r>
+        <w:t xml:space="preserve"> </w:t>
+      </w:r>
+      <w:r>
+        <w:rPr>
+          <w:iCs/>
+          <w:i/>
+        </w:rPr>
+        <w:t xml:space="preserve">(§18.5.1)</w:t>
+      </w:r>
+    </w:p>
+    <w:p>
+      <w:pPr>
+        <w:pStyle w:val="BodyText"/>
+      </w:pPr>
+      <w:r>
+        <w:rPr>
+          <w:bCs/>
+          <w:b/>
+        </w:rPr>
         <w:t xml:space="preserve">Stateless service</w:t>
       </w:r>
       <w:r>
@@ -15259,6 +18962,82 @@
           <w:bCs/>
           <w:b/>
         </w:rPr>
+        <w:t xml:space="preserve">Timeout and deadline</w:t>
+      </w:r>
+      <w:r>
+        <w:t xml:space="preserve"> </w:t>
+      </w:r>
+      <w:r>
+        <w:t xml:space="preserve">— A</w:t>
+      </w:r>
+      <w:r>
+        <w:t xml:space="preserve"> </w:t>
+      </w:r>
+      <w:r>
+        <w:rPr>
+          <w:bCs/>
+          <w:b/>
+        </w:rPr>
+        <w:t xml:space="preserve">timeout</w:t>
+      </w:r>
+      <w:r>
+        <w:t xml:space="preserve"> </w:t>
+      </w:r>
+      <w:r>
+        <w:t xml:space="preserve">is a relative duration after which a caller stops waiting for one operation (for example 300 ms). A</w:t>
+      </w:r>
+      <w:r>
+        <w:t xml:space="preserve"> </w:t>
+      </w:r>
+      <w:r>
+        <w:rPr>
+          <w:bCs/>
+          <w:b/>
+        </w:rPr>
+        <w:t xml:space="preserve">deadline</w:t>
+      </w:r>
+      <w:r>
+        <w:t xml:space="preserve"> </w:t>
+      </w:r>
+      <w:r>
+        <w:t xml:space="preserve">is an absolute point in time by which the</w:t>
+      </w:r>
+      <w:r>
+        <w:t xml:space="preserve"> </w:t>
+      </w:r>
+      <w:r>
+        <w:rPr>
+          <w:iCs/>
+          <w:i/>
+        </w:rPr>
+        <w:t xml:space="preserve">whole</w:t>
+      </w:r>
+      <w:r>
+        <w:t xml:space="preserve"> </w:t>
+      </w:r>
+      <w:r>
+        <w:t xml:space="preserve">request must complete; it is passed along the call chain so that every downstream call knows how much time remains.</w:t>
+      </w:r>
+      <w:r>
+        <w:t xml:space="preserve"> </w:t>
+      </w:r>
+      <w:r>
+        <w:rPr>
+          <w:iCs/>
+          <w:i/>
+        </w:rPr>
+        <w:t xml:space="preserve">(§22.11)</w:t>
+      </w:r>
+    </w:p>
+    <w:p>
+      <w:pPr>
+        <w:pStyle w:val="BodyText"/>
+      </w:pPr>
+      <w:r>
+        <w:rPr>
+          <w:bCs/>
+          <w:b/>
+        </w:rPr>
         <w:t xml:space="preserve">Time-series database (TSDB)</w:t>
       </w:r>
       <w:r>
@@ -15339,6 +19118,219 @@
           <w:i/>
         </w:rPr>
         <w:t xml:space="preserve">(§12.8.1)</w:t>
+      </w:r>
+    </w:p>
+    <w:p>
+      <w:pPr>
+        <w:pStyle w:val="BodyText"/>
+      </w:pPr>
+      <w:r>
+        <w:rPr>
+          <w:bCs/>
+          <w:b/>
+        </w:rPr>
+        <w:t xml:space="preserve">Time to live (TTL)</w:t>
+      </w:r>
+      <w:r>
+        <w:t xml:space="preserve"> </w:t>
+      </w:r>
+      <w:r>
+        <w:t xml:space="preserve">— The maximum time an entry may be served after it was stored. After the TTL the entry is treated as absent (or, with stale-while-revalidate, as stale). Redis removes expired keys lazily when they are accessed and actively by periodically sampling keys that have a TTL [Redis Docs: EXPIRE].</w:t>
+      </w:r>
+      <w:r>
+        <w:t xml:space="preserve"> </w:t>
+      </w:r>
+      <w:r>
+        <w:rPr>
+          <w:iCs/>
+          <w:i/>
+        </w:rPr>
+        <w:t xml:space="preserve">(§20.8)</w:t>
+      </w:r>
+    </w:p>
+    <w:p>
+      <w:pPr>
+        <w:pStyle w:val="BodyText"/>
+      </w:pPr>
+      <w:r>
+        <w:rPr>
+          <w:bCs/>
+          <w:b/>
+        </w:rPr>
+        <w:t xml:space="preserve">TinyLFU</w:t>
+      </w:r>
+      <w:r>
+        <w:t xml:space="preserve"> </w:t>
+      </w:r>
+      <w:r>
+        <w:t xml:space="preserve">— An</w:t>
+      </w:r>
+      <w:r>
+        <w:t xml:space="preserve"> </w:t>
+      </w:r>
+      <w:r>
+        <w:rPr>
+          <w:bCs/>
+          <w:b/>
+        </w:rPr>
+        <w:t xml:space="preserve">admission policy</w:t>
+      </w:r>
+      <w:r>
+        <w:t xml:space="preserve">: when the cache is full and a new candidate arrives, admit it only if its estimated access frequency exceeds that of the victim the eviction policy would remove. Frequencies are estimated by a small approximate sketch (a Count-Min sketch with 4-bit counters, §17.6) over a sample of recent requests, and</w:t>
+      </w:r>
+      <w:r>
+        <w:t xml:space="preserve"> </w:t>
+      </w:r>
+      <w:r>
+        <w:rPr>
+          <w:bCs/>
+          <w:b/>
+        </w:rPr>
+        <w:t xml:space="preserve">aged</w:t>
+      </w:r>
+      <w:r>
+        <w:t xml:space="preserve"> </w:t>
+      </w:r>
+      <w:r>
+        <w:t xml:space="preserve">by halving every counter after a fixed number of requests [Einziger, Friedman &amp; Manes 2017].</w:t>
+      </w:r>
+      <w:r>
+        <w:t xml:space="preserve"> </w:t>
+      </w:r>
+      <w:r>
+        <w:rPr>
+          <w:iCs/>
+          <w:i/>
+        </w:rPr>
+        <w:t xml:space="preserve">(§20.9.3)</w:t>
+      </w:r>
+    </w:p>
+    <w:p>
+      <w:pPr>
+        <w:pStyle w:val="BodyText"/>
+      </w:pPr>
+      <w:r>
+        <w:rPr>
+          <w:bCs/>
+          <w:b/>
+        </w:rPr>
+        <w:t xml:space="preserve">Token bucket</w:t>
+      </w:r>
+      <w:r>
+        <w:t xml:space="preserve"> </w:t>
+      </w:r>
+      <w:r>
+        <w:t xml:space="preserve">— A rate limiter that keeps a counter of</w:t>
+      </w:r>
+      <w:r>
+        <w:t xml:space="preserve"> </w:t>
+      </w:r>
+      <w:r>
+        <w:rPr>
+          <w:bCs/>
+          <w:b/>
+        </w:rPr>
+        <w:t xml:space="preserve">tokens</w:t>
+      </w:r>
+      <w:r>
+        <w:t xml:space="preserve">, refilled continuously at</w:t>
+      </w:r>
+      <w:r>
+        <w:t xml:space="preserve"> </w:t>
+      </w:r>
+      <w:r>
+        <w:rPr>
+          <w:bCs/>
+          <w:b/>
+        </w:rPr>
+        <w:t xml:space="preserve">rate</w:t>
+      </w:r>
+      <w:r>
+        <w:t xml:space="preserve"> </w:t>
+      </w:r>
+      <m:oMath>
+        <m:r>
+          <m:t>r</m:t>
+        </m:r>
+      </m:oMath>
+      <w:r>
+        <w:t xml:space="preserve"> </w:t>
+      </w:r>
+      <w:r>
+        <w:t xml:space="preserve">up to a maximum</w:t>
+      </w:r>
+      <w:r>
+        <w:t xml:space="preserve"> </w:t>
+      </w:r>
+      <w:r>
+        <w:rPr>
+          <w:bCs/>
+          <w:b/>
+        </w:rPr>
+        <w:t xml:space="preserve">capacity</w:t>
+      </w:r>
+      <w:r>
+        <w:t xml:space="preserve"> </w:t>
+      </w:r>
+      <w:r>
+        <w:t xml:space="preserve">(burst size)</w:t>
+      </w:r>
+      <w:r>
+        <w:t xml:space="preserve"> </w:t>
+      </w:r>
+      <m:oMath>
+        <m:r>
+          <m:t>b</m:t>
+        </m:r>
+      </m:oMath>
+      <w:r>
+        <w:t xml:space="preserve">. Each request consumes one token (or a cost</w:t>
+      </w:r>
+      <w:r>
+        <w:t xml:space="preserve"> </w:t>
+      </w:r>
+      <m:oMath>
+        <m:r>
+          <m:t>c</m:t>
+        </m:r>
+      </m:oMath>
+      <w:r>
+        <w:t xml:space="preserve">); a request that finds too few tokens is rejected. The long-run admitted rate is at most</w:t>
+      </w:r>
+      <w:r>
+        <w:t xml:space="preserve"> </w:t>
+      </w:r>
+      <m:oMath>
+        <m:r>
+          <m:t>r</m:t>
+        </m:r>
+      </m:oMath>
+      <w:r>
+        <w:t xml:space="preserve">, and up to</w:t>
+      </w:r>
+      <w:r>
+        <w:t xml:space="preserve"> </w:t>
+      </w:r>
+      <m:oMath>
+        <m:r>
+          <m:t>b</m:t>
+        </m:r>
+      </m:oMath>
+      <w:r>
+        <w:t xml:space="preserve"> </w:t>
+      </w:r>
+      <w:r>
+        <w:t xml:space="preserve">requests may be admitted at once.</w:t>
+      </w:r>
+      <w:r>
+        <w:t xml:space="preserve"> </w:t>
+      </w:r>
+      <w:r>
+        <w:rPr>
+          <w:iCs/>
+          <w:i/>
+        </w:rPr>
+        <w:t xml:space="preserve">(§22.4.1)</w:t>
       </w:r>
     </w:p>
     <w:p>
@@ -15810,6 +19802,86 @@
           <w:i/>
         </w:rPr>
         <w:t xml:space="preserve">(§7.8)</w:t>
+      </w:r>
+    </w:p>
+    <w:p>
+      <w:pPr>
+        <w:pStyle w:val="BodyText"/>
+      </w:pPr>
+      <w:r>
+        <w:rPr>
+          <w:bCs/>
+          <w:b/>
+        </w:rPr>
+        <w:t xml:space="preserve">USE method</w:t>
+      </w:r>
+      <w:r>
+        <w:t xml:space="preserve"> </w:t>
+      </w:r>
+      <w:r>
+        <w:t xml:space="preserve">— For every</w:t>
+      </w:r>
+      <w:r>
+        <w:t xml:space="preserve"> </w:t>
+      </w:r>
+      <w:r>
+        <w:rPr>
+          <w:bCs/>
+          <w:b/>
+        </w:rPr>
+        <w:t xml:space="preserve">resource</w:t>
+      </w:r>
+      <w:r>
+        <w:t xml:space="preserve">, check</w:t>
+      </w:r>
+      <w:r>
+        <w:t xml:space="preserve"> </w:t>
+      </w:r>
+      <w:r>
+        <w:rPr>
+          <w:bCs/>
+          <w:b/>
+        </w:rPr>
+        <w:t xml:space="preserve">U</w:t>
+      </w:r>
+      <w:r>
+        <w:t xml:space="preserve">tilization (the fraction of time the resource was busy, or the fraction of its capacity in use),</w:t>
+      </w:r>
+      <w:r>
+        <w:t xml:space="preserve"> </w:t>
+      </w:r>
+      <w:r>
+        <w:rPr>
+          <w:bCs/>
+          <w:b/>
+        </w:rPr>
+        <w:t xml:space="preserve">S</w:t>
+      </w:r>
+      <w:r>
+        <w:t xml:space="preserve">aturation (the amount of extra work queued because the resource could not service it) and</w:t>
+      </w:r>
+      <w:r>
+        <w:t xml:space="preserve"> </w:t>
+      </w:r>
+      <w:r>
+        <w:rPr>
+          <w:bCs/>
+          <w:b/>
+        </w:rPr>
+        <w:t xml:space="preserve">E</w:t>
+      </w:r>
+      <w:r>
+        <w:t xml:space="preserve">rrors (the count of error events) [Gregg USE]. A resource is any physical or software component with finite capacity: CPUs, memory, disks, network interfaces, controllers and interconnects, but also locks, thread pools, connection pools and file descriptors.</w:t>
+      </w:r>
+      <w:r>
+        <w:t xml:space="preserve"> </w:t>
+      </w:r>
+      <w:r>
+        <w:rPr>
+          <w:iCs/>
+          <w:i/>
+        </w:rPr>
+        <w:t xml:space="preserve">(§23.3.2)</w:t>
       </w:r>
     </w:p>
     <w:bookmarkEnd w:id="40"/>
@@ -16243,6 +20315,34 @@
           <w:bCs/>
           <w:b/>
         </w:rPr>
+        <w:t xml:space="preserve">Vertical scaling (scaling up)</w:t>
+      </w:r>
+      <w:r>
+        <w:t xml:space="preserve"> </w:t>
+      </w:r>
+      <w:r>
+        <w:t xml:space="preserve">— Increasing the capacity of a single node by giving it more or faster CPU cores, memory, storage or network bandwidth, for example by moving a database from an 8-core to a 64-core machine.</w:t>
+      </w:r>
+      <w:r>
+        <w:t xml:space="preserve"> </w:t>
+      </w:r>
+      <w:r>
+        <w:rPr>
+          <w:iCs/>
+          <w:i/>
+        </w:rPr>
+        <w:t xml:space="preserve">(§18.3.1)</w:t>
+      </w:r>
+    </w:p>
+    <w:p>
+      <w:pPr>
+        <w:pStyle w:val="BodyText"/>
+      </w:pPr>
+      <w:r>
+        <w:rPr>
+          <w:bCs/>
+          <w:b/>
+        </w:rPr>
         <w:t xml:space="preserve">Virtual memory</w:t>
       </w:r>
       <w:r>
@@ -16688,6 +20788,106 @@
         <w:t xml:space="preserve">(§13.5.1)</w:t>
       </w:r>
     </w:p>
+    <w:p>
+      <w:pPr>
+        <w:pStyle w:val="BodyText"/>
+      </w:pPr>
+      <w:r>
+        <w:rPr>
+          <w:bCs/>
+          <w:b/>
+        </w:rPr>
+        <w:t xml:space="preserve">Write-around</w:t>
+      </w:r>
+      <w:r>
+        <w:t xml:space="preserve"> </w:t>
+      </w:r>
+      <w:r>
+        <w:t xml:space="preserve">— Writes go directly to the database and bypass the cache; the cache is populated only by reads (usually cache-aside), and the written key is invalidated or left to expire.</w:t>
+      </w:r>
+      <w:r>
+        <w:t xml:space="preserve"> </w:t>
+      </w:r>
+      <w:r>
+        <w:rPr>
+          <w:iCs/>
+          <w:i/>
+        </w:rPr>
+        <w:t xml:space="preserve">(§20.7.6)</w:t>
+      </w:r>
+    </w:p>
+    <w:p>
+      <w:pPr>
+        <w:pStyle w:val="BodyText"/>
+      </w:pPr>
+      <w:r>
+        <w:rPr>
+          <w:bCs/>
+          <w:b/>
+        </w:rPr>
+        <w:t xml:space="preserve">Write-back</w:t>
+      </w:r>
+      <w:r>
+        <w:t xml:space="preserve"> </w:t>
+      </w:r>
+      <w:r>
+        <w:t xml:space="preserve">— Writes update only the cache and are acknowledged immediately; the cache marks entries</w:t>
+      </w:r>
+      <w:r>
+        <w:t xml:space="preserve"> </w:t>
+      </w:r>
+      <w:r>
+        <w:rPr>
+          <w:bCs/>
+          <w:b/>
+        </w:rPr>
+        <w:t xml:space="preserve">dirty</w:t>
+      </w:r>
+      <w:r>
+        <w:t xml:space="preserve"> </w:t>
+      </w:r>
+      <w:r>
+        <w:t xml:space="preserve">and flushes them to the database asynchronously, in batches or after a delay.</w:t>
+      </w:r>
+      <w:r>
+        <w:t xml:space="preserve"> </w:t>
+      </w:r>
+      <w:r>
+        <w:rPr>
+          <w:iCs/>
+          <w:i/>
+        </w:rPr>
+        <w:t xml:space="preserve">(§20.7.5)</w:t>
+      </w:r>
+    </w:p>
+    <w:p>
+      <w:pPr>
+        <w:pStyle w:val="BodyText"/>
+      </w:pPr>
+      <w:r>
+        <w:rPr>
+          <w:bCs/>
+          <w:b/>
+        </w:rPr>
+        <w:t xml:space="preserve">Write-through</w:t>
+      </w:r>
+      <w:r>
+        <w:t xml:space="preserve"> </w:t>
+      </w:r>
+      <w:r>
+        <w:t xml:space="preserve">— Every write goes to the cache, which synchronously writes it to the database before acknowledging; the cache is updated and the database is updated as one client-visible operation.</w:t>
+      </w:r>
+      <w:r>
+        <w:t xml:space="preserve"> </w:t>
+      </w:r>
+      <w:r>
+        <w:rPr>
+          <w:iCs/>
+          <w:i/>
+        </w:rPr>
+        <w:t xml:space="preserve">(§20.7.4)</w:t>
+      </w:r>
+    </w:p>
     <w:bookmarkEnd w:id="42"/>
     <w:bookmarkStart w:id="43" w:name="z"/>
     <w:p>
@@ -16742,6 +20942,113 @@
           <w:i/>
         </w:rPr>
         <w:t xml:space="preserve">(§10.10.1)</w:t>
+      </w:r>
+    </w:p>
+    <w:p>
+      <w:pPr>
+        <w:pStyle w:val="BodyText"/>
+      </w:pPr>
+      <w:r>
+        <w:rPr>
+          <w:bCs/>
+          <w:b/>
+        </w:rPr>
+        <w:t xml:space="preserve">Zipf (Zipf-like) distribution</w:t>
+      </w:r>
+      <w:r>
+        <w:t xml:space="preserve"> </w:t>
+      </w:r>
+      <w:r>
+        <w:t xml:space="preserve">— A popularity law in which the item of popularity rank</w:t>
+      </w:r>
+      <w:r>
+        <w:t xml:space="preserve"> </w:t>
+      </w:r>
+      <m:oMath>
+        <m:r>
+          <m:t>i</m:t>
+        </m:r>
+      </m:oMath>
+      <w:r>
+        <w:t xml:space="preserve"> </w:t>
+      </w:r>
+      <w:r>
+        <w:t xml:space="preserve">is requested with probability proportional to</w:t>
+      </w:r>
+      <w:r>
+        <w:t xml:space="preserve"> </w:t>
+      </w:r>
+      <m:oMath>
+        <m:r>
+          <m:t>1</m:t>
+        </m:r>
+        <m:r>
+          <m:rPr>
+            <m:sty m:val="p"/>
+          </m:rPr>
+          <m:t>/</m:t>
+        </m:r>
+        <m:sSup>
+          <m:e>
+            <m:r>
+              <m:t>i</m:t>
+            </m:r>
+          </m:e>
+          <m:sup>
+            <m:r>
+              <m:t>s</m:t>
+            </m:r>
+          </m:sup>
+        </m:sSup>
+      </m:oMath>
+      <w:r>
+        <w:t xml:space="preserve">, where</w:t>
+      </w:r>
+      <w:r>
+        <w:t xml:space="preserve"> </w:t>
+      </w:r>
+      <m:oMath>
+        <m:r>
+          <m:t>s</m:t>
+        </m:r>
+        <m:r>
+          <m:rPr>
+            <m:sty m:val="p"/>
+          </m:rPr>
+          <m:t>&gt;</m:t>
+        </m:r>
+        <m:r>
+          <m:t>0</m:t>
+        </m:r>
+      </m:oMath>
+      <w:r>
+        <w:t xml:space="preserve"> </w:t>
+      </w:r>
+      <w:r>
+        <w:t xml:space="preserve">is the</w:t>
+      </w:r>
+      <w:r>
+        <w:t xml:space="preserve"> </w:t>
+      </w:r>
+      <w:r>
+        <w:rPr>
+          <w:bCs/>
+          <w:b/>
+        </w:rPr>
+        <w:t xml:space="preserve">skew exponent</w:t>
+      </w:r>
+      <w:r>
+        <w:t xml:space="preserve">. Breslau et al. found that requests to web proxies follow a Zipf-like law with an exponent below 1 and that, as a consequence, hit ratio grows roughly logarithmically with cache size [Breslau et al. 1999].</w:t>
+      </w:r>
+      <w:r>
+        <w:t xml:space="preserve"> </w:t>
+      </w:r>
+      <w:r>
+        <w:rPr>
+          <w:iCs/>
+          <w:i/>
+        </w:rPr>
+        <w:t xml:space="preserve">(§20.3.3)</w:t>
       </w:r>
     </w:p>
     <w:bookmarkEnd w:id="43"/>

</xml_diff>